<commit_message>
Run all experiments and fill report with real results
- Fix training: scale RUL target to [0,1], patience 20 (LSTM no longer
  collapses to the mean); 1D-CNN flattens instead of average pooling
- Results for 5 models x 5 seeds on FD001/FD003 plus window/cap ablation
- Move figures to make_figures.py; fix trajectory plot output scaling
- Report: real tables, figures, attention analysis, rewritten results,
  discussion, abstract and conclusion; placeholders removed

Co-Authored-By: Claude Opus 5.5 <noreply@anthropic.com>
Claude-Session: https://claude.ai/code/session_01CagGZ3MZ5RKTUY41265D1Q
</commit_message>
<xml_diff>
--- a/report/DL_ESE_Project_Report_Predictive_Maintenance.docx
+++ b/report/DL_ESE_Project_Report_Predictive_Maintenance.docx
@@ -551,55 +551,7 @@
           <w:sz w:val="18"/>
           <w:szCs w:val="18"/>
         </w:rPr>
-        <w:t xml:space="preserve">Unplanned equipment failure is one of the largest sources of downtime and safety risk in aviation, manufacturing and energy systems. Predictive maintenance (PdM) replaces fixed service intervals with decisions based on the measured health of a machine, and its central quantity is the Remaining Useful Life (RUL): the number of operating cycles left before failure. This report presents a deep learning pipeline that estimates RUL directly from multivariate time-series sensor data, evaluated on the NASA C-MAPSS turbofan engine benchmark. Raw sensor streams are filtered to the informative channels, normalised per operating condition, labelled with a piece-wise linear RUL target capped at 125 cycles and converted into 30-cycle sliding windows. Under one shared pipeline we compare two classical baselines (Linear Regression and Random Forest) with three deep models: a 1D Convolutional Neural Network (1D-CNN), a stacked Long Short-Term Memory (LSTM) network, and a hybrid CNN-LSTM with temporal attention. Models are scored with Root Mean Squared Error (RMSE) and the asymmetric PHM08 score, which penalises late predictions more than early ones. On FD001 the CNN-LSTM with attention achieves the lowest error, with an RMSE of </w:t>
-      </w:r>
-      <w:r>
-        <w:rPr>
-          <w:sz w:val="18"/>
-          <w:szCs w:val="18"/>
-          <w:highlight w:val="yellow"/>
-          <w:highlightCs w:val="yellow"/>
-        </w:rPr>
-        <w:t xml:space="preserve">12.9</w:t>
-      </w:r>
-      <w:r>
-        <w:rPr>
-          <w:sz w:val="18"/>
-          <w:szCs w:val="18"/>
-        </w:rPr>
-        <w:t xml:space="preserve"> cycles and a PHM08 score of </w:t>
-      </w:r>
-      <w:r>
-        <w:rPr>
-          <w:sz w:val="18"/>
-          <w:szCs w:val="18"/>
-          <w:highlight w:val="yellow"/>
-          <w:highlightCs w:val="yellow"/>
-        </w:rPr>
-        <w:t xml:space="preserve">271</w:t>
-      </w:r>
-      <w:r>
-        <w:rPr>
-          <w:sz w:val="18"/>
-          <w:szCs w:val="18"/>
-        </w:rPr>
-        <w:t xml:space="preserve">, against </w:t>
-      </w:r>
-      <w:r>
-        <w:rPr>
-          <w:sz w:val="18"/>
-          <w:szCs w:val="18"/>
-          <w:highlight w:val="yellow"/>
-          <w:highlightCs w:val="yellow"/>
-        </w:rPr>
-        <w:t xml:space="preserve">17.6</w:t>
-      </w:r>
-      <w:r>
-        <w:rPr>
-          <w:sz w:val="18"/>
-          <w:szCs w:val="18"/>
-        </w:rPr>
-        <w:t xml:space="preserve"> for the Random Forest baseline. Qualitative analysis of prediction trajectories and attention weights shows that the sequence models track the onset of degradation and concentrate on the most recent cycles of each window, supporting their use for maintenance scheduling.</w:t>
+        <w:t xml:space="preserve">Unplanned equipment failure is one of the largest sources of downtime and safety risk in aviation, manufacturing and energy systems. Predictive maintenance (PdM) replaces fixed service intervals with decisions based on the measured health of a machine, and its central quantity is the Remaining Useful Life (RUL): the number of operating cycles left before failure. This report presents a deep learning pipeline that estimates RUL directly from multivariate time-series sensor data, evaluated on the NASA C-MAPSS turbofan engine benchmark. Raw sensor streams are filtered to 14 informative channels, min-max normalised, labelled with a piece-wise linear RUL target capped at 125 cycles and converted into 30-cycle sliding windows. Under one shared pipeline we compare two classical baselines (Linear Regression and Random Forest) with three deep models: a 1D Convolutional Neural Network (1D-CNN), a stacked Long Short-Term Memory (LSTM) network, and a hybrid CNN-LSTM with additive temporal attention. Models are scored with Root Mean Squared Error (RMSE) and the asymmetric PHM08 score, which penalises late predictions more than early ones, averaged over five seeds. The CNN-LSTM with attention achieves the lowest RMSE on both subsets studied: 13.37 cycles on FD001 and 11.88 on FD003, against 14.99 and 16.26 for the best classical baseline. The plain LSTM, however, obtains the best PHM08 score on both subsets, and on FD001 the gap between the two recurrent models is within seed-to-seed variation. An ablation shows that the RUL cap affects error as much as the choice of architecture, and attention analysis shows that the model places 76% of its weight on the most recent cycle of each window.</w:t>
       </w:r>
     </w:p>
     <w:p>
@@ -3099,7 +3051,7 @@
           <w:sz w:val="21"/>
           <w:szCs w:val="21"/>
         </w:rPr>
-        <w:t xml:space="preserve">Linear Regression and a Random Forest Regressor (200 trees) are trained on flattened windows, giving a reference point without temporal modelling.</w:t>
+        <w:t xml:space="preserve">Linear Regression and a Random Forest Regressor (200 trees, minimum 5 samples per leaf) are trained on flattened windows, giving a reference point without temporal modelling.</w:t>
       </w:r>
     </w:p>
     <w:p>
@@ -3122,7 +3074,7 @@
           <w:sz w:val="21"/>
           <w:szCs w:val="21"/>
         </w:rPr>
-        <w:t xml:space="preserve">Two Conv1D layers (64 filters, kernel sizes 5 and 3, ReLU) extract local patterns across time and sensors, followed by global average pooling, a 64-unit dense layer, dropout of 0.3 and a single linear output.</w:t>
+        <w:t xml:space="preserve">Two Conv1D layers (64 filters, kernel sizes 5 and 3, ReLU) extract local patterns across time and sensors, whose output is flattened (keeping the position of each time step) and passed to a 64-unit dense layer, dropout of 0.3 and a single linear output.</w:t>
       </w:r>
     </w:p>
     <w:p>
@@ -3195,7 +3147,7 @@
           <w:sz w:val="21"/>
           <w:szCs w:val="21"/>
         </w:rPr>
-        <w:t xml:space="preserve">All deep models are trained with the settings in Table III. Each configuration is trained with five random seeds and we report the mean and standard deviation.</w:t>
+        <w:t xml:space="preserve">All deep models are trained with the settings in Table III. Each configuration is trained with five random seeds (model initialisation and batch order) on a fixed engine-level train/validation split, and we report the mean and standard deviation. Linear Regression is deterministic, so it is run once.</w:t>
       </w:r>
     </w:p>
     <w:p>
@@ -3374,7 +3326,7 @@
                 <w:sz w:val="17"/>
                 <w:szCs w:val="17"/>
               </w:rPr>
-              <w:t xml:space="preserve">Python 3, TensorFlow / Keras, scikit-learn</w:t>
+              <w:t xml:space="preserve">Python 3, PyTorch, scikit-learn</w:t>
             </w:r>
           </w:p>
         </w:tc>
@@ -3410,7 +3362,7 @@
                 <w:sz w:val="17"/>
                 <w:szCs w:val="17"/>
               </w:rPr>
-              <w:t xml:space="preserve">Loss function</w:t>
+              <w:t xml:space="preserve">Hardware</w:t>
             </w:r>
           </w:p>
         </w:tc>
@@ -3441,7 +3393,7 @@
                 <w:sz w:val="17"/>
                 <w:szCs w:val="17"/>
               </w:rPr>
-              <w:t xml:space="preserve">Mean Squared Error</w:t>
+              <w:t xml:space="preserve">4-core CPU, no GPU</w:t>
             </w:r>
           </w:p>
         </w:tc>
@@ -3477,7 +3429,7 @@
                 <w:sz w:val="17"/>
                 <w:szCs w:val="17"/>
               </w:rPr>
-              <w:t xml:space="preserve">Optimiser</w:t>
+              <w:t xml:space="preserve">Loss function</w:t>
             </w:r>
           </w:p>
         </w:tc>
@@ -3508,7 +3460,7 @@
                 <w:sz w:val="17"/>
                 <w:szCs w:val="17"/>
               </w:rPr>
-              <w:t xml:space="preserve">Adam [12], learning rate 1e-3</w:t>
+              <w:t xml:space="preserve">Mean Squared Error on RUL / 125 (target scaled to [0, 1])</w:t>
             </w:r>
           </w:p>
         </w:tc>
@@ -3544,7 +3496,7 @@
                 <w:sz w:val="17"/>
                 <w:szCs w:val="17"/>
               </w:rPr>
-              <w:t xml:space="preserve">Batch size / max epochs</w:t>
+              <w:t xml:space="preserve">Optimiser</w:t>
             </w:r>
           </w:p>
         </w:tc>
@@ -3575,7 +3527,7 @@
                 <w:sz w:val="17"/>
                 <w:szCs w:val="17"/>
               </w:rPr>
-              <w:t xml:space="preserve">256 / 100</w:t>
+              <w:t xml:space="preserve">Adam [12], learning rate 1e-3</w:t>
             </w:r>
           </w:p>
         </w:tc>
@@ -3611,7 +3563,7 @@
                 <w:sz w:val="17"/>
                 <w:szCs w:val="17"/>
               </w:rPr>
-              <w:t xml:space="preserve">Early stopping</w:t>
+              <w:t xml:space="preserve">Batch size / max epochs</w:t>
             </w:r>
           </w:p>
         </w:tc>
@@ -3642,7 +3594,7 @@
                 <w:sz w:val="17"/>
                 <w:szCs w:val="17"/>
               </w:rPr>
-              <w:t xml:space="preserve">Patience 10 on validation RMSE</w:t>
+              <w:t xml:space="preserve">256 / 150</w:t>
             </w:r>
           </w:p>
         </w:tc>
@@ -3678,7 +3630,7 @@
                 <w:sz w:val="17"/>
                 <w:szCs w:val="17"/>
               </w:rPr>
-              <w:t xml:space="preserve">Window length / RUL cap</w:t>
+              <w:t xml:space="preserve">Early stopping</w:t>
             </w:r>
           </w:p>
         </w:tc>
@@ -3709,7 +3661,7 @@
                 <w:sz w:val="17"/>
                 <w:szCs w:val="17"/>
               </w:rPr>
-              <w:t xml:space="preserve">30 cycles / 125 cycles</w:t>
+              <w:t xml:space="preserve">Patience 20 on validation MSE, best weights restored</w:t>
             </w:r>
           </w:p>
         </w:tc>
@@ -3724,6 +3676,73 @@
             <w:tcBorders>
               <w:top w:val="none" w:color="FFFFFF" w:sz="0"/>
               <w:left w:val="none" w:color="FFFFFF" w:sz="0"/>
+              <w:bottom w:val="none" w:color="FFFFFF" w:sz="0"/>
+              <w:right w:val="none" w:color="FFFFFF" w:sz="0"/>
+            </w:tcBorders>
+            <w:tcMar>
+              <w:top w:type="dxa" w:w="40"/>
+              <w:left w:type="dxa" w:w="80"/>
+              <w:bottom w:type="dxa" w:w="40"/>
+              <w:right w:type="dxa" w:w="80"/>
+            </w:tcMar>
+          </w:tcPr>
+          <w:p>
+            <w:pPr>
+              <w:jc w:val="left"/>
+            </w:pPr>
+            <w:r>
+              <w:rPr>
+                <w:b w:val="false"/>
+                <w:bCs w:val="false"/>
+                <w:sz w:val="17"/>
+                <w:szCs w:val="17"/>
+              </w:rPr>
+              <w:t xml:space="preserve">Window length / RUL cap</w:t>
+            </w:r>
+          </w:p>
+        </w:tc>
+        <w:tc>
+          <w:tcPr>
+            <w:tcW w:type="dxa" w:w="6080"/>
+            <w:tcBorders>
+              <w:top w:val="none" w:color="FFFFFF" w:sz="0"/>
+              <w:left w:val="none" w:color="FFFFFF" w:sz="0"/>
+              <w:bottom w:val="none" w:color="FFFFFF" w:sz="0"/>
+              <w:right w:val="none" w:color="FFFFFF" w:sz="0"/>
+            </w:tcBorders>
+            <w:tcMar>
+              <w:top w:type="dxa" w:w="40"/>
+              <w:left w:type="dxa" w:w="80"/>
+              <w:bottom w:type="dxa" w:w="40"/>
+              <w:right w:type="dxa" w:w="80"/>
+            </w:tcMar>
+          </w:tcPr>
+          <w:p>
+            <w:pPr>
+              <w:jc w:val="center"/>
+            </w:pPr>
+            <w:r>
+              <w:rPr>
+                <w:b w:val="false"/>
+                <w:bCs w:val="false"/>
+                <w:sz w:val="17"/>
+                <w:szCs w:val="17"/>
+              </w:rPr>
+              <w:t xml:space="preserve">30 cycles / 125 cycles</w:t>
+            </w:r>
+          </w:p>
+        </w:tc>
+      </w:tr>
+      <w:tr>
+        <w:trPr>
+          <w:tblHeader w:val="false"/>
+        </w:trPr>
+        <w:tc>
+          <w:tcPr>
+            <w:tcW w:type="dxa" w:w="4000"/>
+            <w:tcBorders>
+              <w:top w:val="none" w:color="FFFFFF" w:sz="0"/>
+              <w:left w:val="none" w:color="FFFFFF" w:sz="0"/>
               <w:bottom w:val="single" w:color="000000" w:sz="4"/>
               <w:right w:val="none" w:color="FFFFFF" w:sz="0"/>
             </w:tcBorders>
@@ -3866,7 +3885,7 @@
           <w:sz w:val="21"/>
           <w:szCs w:val="21"/>
         </w:rPr>
-        <w:t xml:space="preserve">Table IV reports test-set performance on FD001 and FD003, averaged over five seeds.</w:t>
+        <w:t xml:space="preserve">Table IV reports test-set performance on FD001 and FD003. Deep models and the Random Forest are averaged over five seeds; Linear Regression is deterministic and run once. Params is the number of trainable parameters.</w:t>
       </w:r>
     </w:p>
     <w:p>
@@ -4172,10 +4191,8 @@
                 <w:bCs w:val="false"/>
                 <w:sz w:val="17"/>
                 <w:szCs w:val="17"/>
-                <w:highlight w:val="yellow"/>
-                <w:highlightCs w:val="yellow"/>
-              </w:rPr>
-              <w:t xml:space="preserve">31.9</w:t>
+              </w:rPr>
+              <w:t xml:space="preserve">14.99</w:t>
             </w:r>
           </w:p>
         </w:tc>
@@ -4205,10 +4222,8 @@
                 <w:bCs w:val="false"/>
                 <w:sz w:val="17"/>
                 <w:szCs w:val="17"/>
-                <w:highlight w:val="yellow"/>
-                <w:highlightCs w:val="yellow"/>
-              </w:rPr>
-              <w:t xml:space="preserve">9,820</w:t>
+              </w:rPr>
+              <w:t xml:space="preserve">374</w:t>
             </w:r>
           </w:p>
         </w:tc>
@@ -4238,10 +4253,8 @@
                 <w:bCs w:val="false"/>
                 <w:sz w:val="17"/>
                 <w:szCs w:val="17"/>
-                <w:highlight w:val="yellow"/>
-                <w:highlightCs w:val="yellow"/>
-              </w:rPr>
-              <w:t xml:space="preserve">33.4</w:t>
+              </w:rPr>
+              <w:t xml:space="preserve">16.26</w:t>
             </w:r>
           </w:p>
         </w:tc>
@@ -4271,10 +4284,8 @@
                 <w:bCs w:val="false"/>
                 <w:sz w:val="17"/>
                 <w:szCs w:val="17"/>
-                <w:highlight w:val="yellow"/>
-                <w:highlightCs w:val="yellow"/>
-              </w:rPr>
-              <w:t xml:space="preserve">11,450</w:t>
+              </w:rPr>
+              <w:t xml:space="preserve">471</w:t>
             </w:r>
           </w:p>
         </w:tc>
@@ -4304,8 +4315,6 @@
                 <w:bCs w:val="false"/>
                 <w:sz w:val="17"/>
                 <w:szCs w:val="17"/>
-                <w:highlight w:val="yellow"/>
-                <w:highlightCs w:val="yellow"/>
               </w:rPr>
               <w:t xml:space="preserve">0.4 K</w:t>
             </w:r>
@@ -4373,10 +4382,8 @@
                 <w:bCs w:val="false"/>
                 <w:sz w:val="17"/>
                 <w:szCs w:val="17"/>
-                <w:highlight w:val="yellow"/>
-                <w:highlightCs w:val="yellow"/>
-              </w:rPr>
-              <w:t xml:space="preserve">17.6 ± 0.3</w:t>
+              </w:rPr>
+              <w:t xml:space="preserve">15.91 ± 0.16</w:t>
             </w:r>
           </w:p>
         </w:tc>
@@ -4406,10 +4413,8 @@
                 <w:bCs w:val="false"/>
                 <w:sz w:val="17"/>
                 <w:szCs w:val="17"/>
-                <w:highlight w:val="yellow"/>
-                <w:highlightCs w:val="yellow"/>
-              </w:rPr>
-              <w:t xml:space="preserve">512 ± 21</w:t>
+              </w:rPr>
+              <w:t xml:space="preserve">570 ± 14</w:t>
             </w:r>
           </w:p>
         </w:tc>
@@ -4439,10 +4444,8 @@
                 <w:bCs w:val="false"/>
                 <w:sz w:val="17"/>
                 <w:szCs w:val="17"/>
-                <w:highlight w:val="yellow"/>
-                <w:highlightCs w:val="yellow"/>
-              </w:rPr>
-              <w:t xml:space="preserve">19.2 ± 0.4</w:t>
+              </w:rPr>
+              <w:t xml:space="preserve">17.43 ± 0.16</w:t>
             </w:r>
           </w:p>
         </w:tc>
@@ -4472,10 +4475,8 @@
                 <w:bCs w:val="false"/>
                 <w:sz w:val="17"/>
                 <w:szCs w:val="17"/>
-                <w:highlight w:val="yellow"/>
-                <w:highlightCs w:val="yellow"/>
-              </w:rPr>
-              <w:t xml:space="preserve">684 ± 30</w:t>
+              </w:rPr>
+              <w:t xml:space="preserve">1,096 ± 48</w:t>
             </w:r>
           </w:p>
         </w:tc>
@@ -4505,8 +4506,6 @@
                 <w:bCs w:val="false"/>
                 <w:sz w:val="17"/>
                 <w:szCs w:val="17"/>
-                <w:highlight w:val="yellow"/>
-                <w:highlightCs w:val="yellow"/>
               </w:rPr>
               <w:t xml:space="preserve">-</w:t>
             </w:r>
@@ -4574,10 +4573,8 @@
                 <w:bCs w:val="false"/>
                 <w:sz w:val="17"/>
                 <w:szCs w:val="17"/>
-                <w:highlight w:val="yellow"/>
-                <w:highlightCs w:val="yellow"/>
-              </w:rPr>
-              <w:t xml:space="preserve">15.1 ± 0.6</w:t>
+              </w:rPr>
+              <w:t xml:space="preserve">13.82 ± 0.19</w:t>
             </w:r>
           </w:p>
         </w:tc>
@@ -4607,10 +4604,8 @@
                 <w:bCs w:val="false"/>
                 <w:sz w:val="17"/>
                 <w:szCs w:val="17"/>
-                <w:highlight w:val="yellow"/>
-                <w:highlightCs w:val="yellow"/>
-              </w:rPr>
-              <w:t xml:space="preserve">388 ± 34</w:t>
+              </w:rPr>
+              <w:t xml:space="preserve">344 ± 21</w:t>
             </w:r>
           </w:p>
         </w:tc>
@@ -4640,10 +4635,8 @@
                 <w:bCs w:val="false"/>
                 <w:sz w:val="17"/>
                 <w:szCs w:val="17"/>
-                <w:highlight w:val="yellow"/>
-                <w:highlightCs w:val="yellow"/>
-              </w:rPr>
-              <w:t xml:space="preserve">15.9 ± 0.7</w:t>
+              </w:rPr>
+              <w:t xml:space="preserve">13.78 ± 0.48</w:t>
             </w:r>
           </w:p>
         </w:tc>
@@ -4673,10 +4666,8 @@
                 <w:bCs w:val="false"/>
                 <w:sz w:val="17"/>
                 <w:szCs w:val="17"/>
-                <w:highlight w:val="yellow"/>
-                <w:highlightCs w:val="yellow"/>
-              </w:rPr>
-              <w:t xml:space="preserve">441 ± 39</w:t>
+              </w:rPr>
+              <w:t xml:space="preserve">477 ± 69</w:t>
             </w:r>
           </w:p>
         </w:tc>
@@ -4706,10 +4697,8 @@
                 <w:bCs w:val="false"/>
                 <w:sz w:val="17"/>
                 <w:szCs w:val="17"/>
-                <w:highlight w:val="yellow"/>
-                <w:highlightCs w:val="yellow"/>
-              </w:rPr>
-              <w:t xml:space="preserve">41 K</w:t>
+              </w:rPr>
+              <w:t xml:space="preserve">139.9 K</w:t>
             </w:r>
           </w:p>
         </w:tc>
@@ -4775,10 +4764,8 @@
                 <w:bCs w:val="false"/>
                 <w:sz w:val="17"/>
                 <w:szCs w:val="17"/>
-                <w:highlight w:val="yellow"/>
-                <w:highlightCs w:val="yellow"/>
-              </w:rPr>
-              <w:t xml:space="preserve">13.8 ± 0.5</w:t>
+              </w:rPr>
+              <w:t xml:space="preserve">13.64 ± 0.52</w:t>
             </w:r>
           </w:p>
         </w:tc>
@@ -4808,10 +4795,8 @@
                 <w:bCs w:val="false"/>
                 <w:sz w:val="17"/>
                 <w:szCs w:val="17"/>
-                <w:highlight w:val="yellow"/>
-                <w:highlightCs w:val="yellow"/>
-              </w:rPr>
-              <w:t xml:space="preserve">312 ± 28</w:t>
+              </w:rPr>
+              <w:t xml:space="preserve">305 ± 46</w:t>
             </w:r>
           </w:p>
         </w:tc>
@@ -4841,10 +4826,8 @@
                 <w:bCs w:val="false"/>
                 <w:sz w:val="17"/>
                 <w:szCs w:val="17"/>
-                <w:highlight w:val="yellow"/>
-                <w:highlightCs w:val="yellow"/>
-              </w:rPr>
-              <w:t xml:space="preserve">14.6 ± 0.6</w:t>
+              </w:rPr>
+              <w:t xml:space="preserve">12.36 ± 0.67</w:t>
             </w:r>
           </w:p>
         </w:tc>
@@ -4874,10 +4857,8 @@
                 <w:bCs w:val="false"/>
                 <w:sz w:val="17"/>
                 <w:szCs w:val="17"/>
-                <w:highlight w:val="yellow"/>
-                <w:highlightCs w:val="yellow"/>
-              </w:rPr>
-              <w:t xml:space="preserve">365 ± 31</w:t>
+              </w:rPr>
+              <w:t xml:space="preserve">261 ± 23</w:t>
             </w:r>
           </w:p>
         </w:tc>
@@ -4907,10 +4888,8 @@
                 <w:bCs w:val="false"/>
                 <w:sz w:val="17"/>
                 <w:szCs w:val="17"/>
-                <w:highlight w:val="yellow"/>
-                <w:highlightCs w:val="yellow"/>
-              </w:rPr>
-              <w:t xml:space="preserve">33 K</w:t>
+              </w:rPr>
+              <w:t xml:space="preserve">34.1 K</w:t>
             </w:r>
           </w:p>
         </w:tc>
@@ -4976,10 +4955,8 @@
                 <w:bCs w:val="false"/>
                 <w:sz w:val="17"/>
                 <w:szCs w:val="17"/>
-                <w:highlight w:val="yellow"/>
-                <w:highlightCs w:val="yellow"/>
-              </w:rPr>
-              <w:t xml:space="preserve">12.9 ± 0.4</w:t>
+              </w:rPr>
+              <w:t xml:space="preserve">13.37 ± 0.35</w:t>
             </w:r>
           </w:p>
         </w:tc>
@@ -5009,10 +4986,8 @@
                 <w:bCs w:val="false"/>
                 <w:sz w:val="17"/>
                 <w:szCs w:val="17"/>
-                <w:highlight w:val="yellow"/>
-                <w:highlightCs w:val="yellow"/>
-              </w:rPr>
-              <w:t xml:space="preserve">271 ± 22</w:t>
+              </w:rPr>
+              <w:t xml:space="preserve">337 ± 23</w:t>
             </w:r>
           </w:p>
         </w:tc>
@@ -5042,10 +5017,8 @@
                 <w:bCs w:val="false"/>
                 <w:sz w:val="17"/>
                 <w:szCs w:val="17"/>
-                <w:highlight w:val="yellow"/>
-                <w:highlightCs w:val="yellow"/>
-              </w:rPr>
-              <w:t xml:space="preserve">13.7 ± 0.5</w:t>
+              </w:rPr>
+              <w:t xml:space="preserve">11.88 ± 0.70</w:t>
             </w:r>
           </w:p>
         </w:tc>
@@ -5075,10 +5048,8 @@
                 <w:bCs w:val="false"/>
                 <w:sz w:val="17"/>
                 <w:szCs w:val="17"/>
-                <w:highlight w:val="yellow"/>
-                <w:highlightCs w:val="yellow"/>
-              </w:rPr>
-              <w:t xml:space="preserve">318 ± 26</w:t>
+              </w:rPr>
+              <w:t xml:space="preserve">303 ± 79</w:t>
             </w:r>
           </w:p>
         </w:tc>
@@ -5108,10 +5079,8 @@
                 <w:bCs w:val="false"/>
                 <w:sz w:val="17"/>
                 <w:szCs w:val="17"/>
-                <w:highlight w:val="yellow"/>
-                <w:highlightCs w:val="yellow"/>
-              </w:rPr>
-              <w:t xml:space="preserve">52 K</w:t>
+              </w:rPr>
+              <w:t xml:space="preserve">44.5 K</w:t>
             </w:r>
           </w:p>
         </w:tc>
@@ -5132,39 +5101,7 @@
           <w:sz w:val="21"/>
           <w:szCs w:val="21"/>
         </w:rPr>
-        <w:t xml:space="preserve">All deep models clearly outperform both baselines. Linear Regression cannot model the non-linear degradation curve and has by far the highest error. The Random Forest is a much stronger baseline, but because it treats a flattened window as a set of independent features it cannot exploit temporal order. The LSTM improves on the 1D-CNN, which suggests that the long-range trend matters more than local patterns. The proposed CNN-LSTM with attention achieves the best result on both subsets, lowering RMSE on FD001 by </w:t>
-      </w:r>
-      <w:r>
-        <w:rPr>
-          <w:sz w:val="21"/>
-          <w:szCs w:val="21"/>
-          <w:highlight w:val="yellow"/>
-          <w:highlightCs w:val="yellow"/>
-        </w:rPr>
-        <w:t xml:space="preserve">26.7%</w:t>
-      </w:r>
-      <w:r>
-        <w:rPr>
-          <w:sz w:val="21"/>
-          <w:szCs w:val="21"/>
-        </w:rPr>
-        <w:t xml:space="preserve"> relative to the Random Forest and by </w:t>
-      </w:r>
-      <w:r>
-        <w:rPr>
-          <w:sz w:val="21"/>
-          <w:szCs w:val="21"/>
-          <w:highlight w:val="yellow"/>
-          <w:highlightCs w:val="yellow"/>
-        </w:rPr>
-        <w:t xml:space="preserve">6.5%</w:t>
-      </w:r>
-      <w:r>
-        <w:rPr>
-          <w:sz w:val="21"/>
-          <w:szCs w:val="21"/>
-        </w:rPr>
-        <w:t xml:space="preserve"> relative to the plain LSTM. The gap is slightly larger on the PHM08 score, which shows that the hybrid model in particular reduces the costly late predictions.</w:t>
+        <w:t xml:space="preserve">All three deep models outperform both classical baselines on RMSE. The proposed CNN-LSTM with attention has the lowest RMSE on both subsets: 13.37 ± 0.35 on FD001 and 11.88 ± 0.70 on FD003. This is 10.8% and 26.9% lower than Linear Regression, the stronger of the two baselines, and 2.0% and 3.9% lower than the plain LSTM.</w:t>
       </w:r>
     </w:p>
     <w:p>
@@ -5178,7 +5115,21 @@
           <w:sz w:val="21"/>
           <w:szCs w:val="21"/>
         </w:rPr>
-        <w:t xml:space="preserve">All models perform worse on FD003 than on FD001, as expected, because two fault modes produce more varied degradation patterns. The ranking of the models stays the same on both subsets.</w:t>
+        <w:t xml:space="preserve">Two results differ from what we expected. First, Linear Regression beats the Random Forest on both subsets (14.99 against 15.91 on FD001). A likely reason is that the flattened input has 420 strongly correlated features, which suits a linear model, while tree ensembles predict averages of training targets and tend to pull extreme RUL values towards the middle. Second, the plain LSTM, not the proposed model, has the best PHM08 score on both subsets (305 on FD001 and 261 on FD003). Since PHM08 punishes late predictions exponentially, this means the LSTM makes fewer large late errors even though its average error is slightly higher. On FD001 the RMSE gap between the two recurrent models (0.27 cycles) is smaller than the LSTM's own seed-to-seed standard deviation (0.52), so the two should be regarded as comparable there; on FD003 the gap is larger.</w:t>
+      </w:r>
+    </w:p>
+    <w:p>
+      <w:pPr>
+        <w:spacing w:after="0" w:line="252"/>
+        <w:ind w:firstLine="202"/>
+        <w:jc w:val="both"/>
+      </w:pPr>
+      <w:r>
+        <w:rPr>
+          <w:sz w:val="21"/>
+          <w:szCs w:val="21"/>
+        </w:rPr>
+        <w:t xml:space="preserve">The advantage of the deep models is larger on FD003, which contains two fault modes. Linear Regression and the Random Forest lose 1.3 to 1.5 cycles of RMSE from FD001 to FD003, while the recurrent models improve, suggesting that sequence models cope better with more varied degradation patterns. FD003 also has more training windows (17,273 against 13,980), which benefits the larger models.</w:t>
       </w:r>
     </w:p>
     <w:p>
@@ -5205,7 +5156,7 @@
           <w:sz w:val="21"/>
           <w:szCs w:val="21"/>
         </w:rPr>
-        <w:t xml:space="preserve">Table V varies the window length and RUL cap for the proposed model on FD001 while keeping all other settings fixed.</w:t>
+        <w:t xml:space="preserve">Table V varies the window length and RUL cap for the proposed model on FD001 while keeping all other settings fixed (mean ± std over three seeds). To keep rows comparable, every setting is scored against the same target, the true RUL capped at 125 cycles.</w:t>
       </w:r>
     </w:p>
     <w:p>
@@ -5478,10 +5429,8 @@
                 <w:bCs w:val="false"/>
                 <w:sz w:val="17"/>
                 <w:szCs w:val="17"/>
-                <w:highlight w:val="yellow"/>
-                <w:highlightCs w:val="yellow"/>
-              </w:rPr>
-              <w:t xml:space="preserve">14.2</w:t>
+              </w:rPr>
+              <w:t xml:space="preserve">15.96 ± 0.50</w:t>
             </w:r>
           </w:p>
         </w:tc>
@@ -5511,10 +5460,8 @@
                 <w:bCs w:val="false"/>
                 <w:sz w:val="17"/>
                 <w:szCs w:val="17"/>
-                <w:highlight w:val="yellow"/>
-                <w:highlightCs w:val="yellow"/>
-              </w:rPr>
-              <w:t xml:space="preserve">335</w:t>
+              </w:rPr>
+              <w:t xml:space="preserve">667 ± 16</w:t>
             </w:r>
           </w:p>
         </w:tc>
@@ -5611,10 +5558,8 @@
                 <w:bCs w:val="false"/>
                 <w:sz w:val="17"/>
                 <w:szCs w:val="17"/>
-                <w:highlight w:val="yellow"/>
-                <w:highlightCs w:val="yellow"/>
-              </w:rPr>
-              <w:t xml:space="preserve">12.9</w:t>
+              </w:rPr>
+              <w:t xml:space="preserve">13.31 ± 0.23</w:t>
             </w:r>
           </w:p>
         </w:tc>
@@ -5644,10 +5589,8 @@
                 <w:bCs w:val="false"/>
                 <w:sz w:val="17"/>
                 <w:szCs w:val="17"/>
-                <w:highlight w:val="yellow"/>
-                <w:highlightCs w:val="yellow"/>
-              </w:rPr>
-              <w:t xml:space="preserve">271</w:t>
+              </w:rPr>
+              <w:t xml:space="preserve">326 ± 22</w:t>
             </w:r>
           </w:p>
         </w:tc>
@@ -5744,10 +5687,8 @@
                 <w:bCs w:val="false"/>
                 <w:sz w:val="17"/>
                 <w:szCs w:val="17"/>
-                <w:highlight w:val="yellow"/>
-                <w:highlightCs w:val="yellow"/>
-              </w:rPr>
-              <w:t xml:space="preserve">13.1</w:t>
+              </w:rPr>
+              <w:t xml:space="preserve">13.49 ± 0.35</w:t>
             </w:r>
           </w:p>
         </w:tc>
@@ -5777,10 +5718,8 @@
                 <w:bCs w:val="false"/>
                 <w:sz w:val="17"/>
                 <w:szCs w:val="17"/>
-                <w:highlight w:val="yellow"/>
-                <w:highlightCs w:val="yellow"/>
-              </w:rPr>
-              <w:t xml:space="preserve">279</w:t>
+              </w:rPr>
+              <w:t xml:space="preserve">324 ± 37</w:t>
             </w:r>
           </w:p>
         </w:tc>
@@ -5877,10 +5816,8 @@
                 <w:bCs w:val="false"/>
                 <w:sz w:val="17"/>
                 <w:szCs w:val="17"/>
-                <w:highlight w:val="yellow"/>
-                <w:highlightCs w:val="yellow"/>
-              </w:rPr>
-              <w:t xml:space="preserve">13.4</w:t>
+              </w:rPr>
+              <w:t xml:space="preserve">12.66 ± 0.15</w:t>
             </w:r>
           </w:p>
         </w:tc>
@@ -5910,10 +5847,8 @@
                 <w:bCs w:val="false"/>
                 <w:sz w:val="17"/>
                 <w:szCs w:val="17"/>
-                <w:highlight w:val="yellow"/>
-                <w:highlightCs w:val="yellow"/>
-              </w:rPr>
-              <w:t xml:space="preserve">290</w:t>
+              </w:rPr>
+              <w:t xml:space="preserve">251 ± 9</w:t>
             </w:r>
           </w:p>
         </w:tc>
@@ -6010,10 +5945,8 @@
                 <w:bCs w:val="false"/>
                 <w:sz w:val="17"/>
                 <w:szCs w:val="17"/>
-                <w:highlight w:val="yellow"/>
-                <w:highlightCs w:val="yellow"/>
-              </w:rPr>
-              <w:t xml:space="preserve">13.2</w:t>
+              </w:rPr>
+              <w:t xml:space="preserve">14.58 ± 0.26</w:t>
             </w:r>
           </w:p>
         </w:tc>
@@ -6043,10 +5976,8 @@
                 <w:bCs w:val="false"/>
                 <w:sz w:val="17"/>
                 <w:szCs w:val="17"/>
-                <w:highlight w:val="yellow"/>
-                <w:highlightCs w:val="yellow"/>
-              </w:rPr>
-              <w:t xml:space="preserve">284</w:t>
+              </w:rPr>
+              <w:t xml:space="preserve">484 ± 39</w:t>
             </w:r>
           </w:p>
         </w:tc>
@@ -6143,10 +6074,8 @@
                 <w:bCs w:val="false"/>
                 <w:sz w:val="17"/>
                 <w:szCs w:val="17"/>
-                <w:highlight w:val="yellow"/>
-                <w:highlightCs w:val="yellow"/>
-              </w:rPr>
-              <w:t xml:space="preserve">19.8</w:t>
+              </w:rPr>
+              <w:t xml:space="preserve">28.30 ± 1.73</w:t>
             </w:r>
           </w:p>
         </w:tc>
@@ -6176,10 +6105,8 @@
                 <w:bCs w:val="false"/>
                 <w:sz w:val="17"/>
                 <w:szCs w:val="17"/>
-                <w:highlight w:val="yellow"/>
-                <w:highlightCs w:val="yellow"/>
-              </w:rPr>
-              <w:t xml:space="preserve">1,140</w:t>
+              </w:rPr>
+              <w:t xml:space="preserve">463,833 ± 549,347</w:t>
             </w:r>
           </w:p>
         </w:tc>
@@ -6200,23 +6127,7 @@
           <w:sz w:val="21"/>
           <w:szCs w:val="21"/>
         </w:rPr>
-        <w:t xml:space="preserve">A 30-cycle window gives the best trade-off: shorter windows hold too little trend information, while longer windows add little and reduce the number of training samples for short-lived engines. Removing the RUL cap degrades performance sharply (RMSE </w:t>
-      </w:r>
-      <w:r>
-        <w:rPr>
-          <w:sz w:val="21"/>
-          <w:szCs w:val="21"/>
-          <w:highlight w:val="yellow"/>
-          <w:highlightCs w:val="yellow"/>
-        </w:rPr>
-        <w:t xml:space="preserve">19.8</w:t>
-      </w:r>
-      <w:r>
-        <w:rPr>
-          <w:sz w:val="21"/>
-          <w:szCs w:val="21"/>
-        </w:rPr>
-        <w:t xml:space="preserve">), confirming that a linear target over the whole life forces the model to predict differences it cannot observe in the healthy phase.</w:t>
+        <w:t xml:space="preserve">A 20-cycle window is clearly too short (RMSE 15.96), while 30 and 40 cycles perform almost identically (13.31 and 13.49), so 30 cycles is a sufficient history. The RUL cap matters more. Training without a cap is by far the worst setting (RMSE 28.30): the model learns to predict values well above 125 for healthy engines, which it cannot justify from sensor data. A cap of 115 gives a lower error than 125 (12.66 against 13.31), and 130 a higher one (14.58). Part of this effect comes from scoring every row against the cap-125 target, which favours models whose predictions stay below 125. We keep 125 as the main setting because it was fixed in advance following the literature, and choosing it from test results would bias the comparison in Table IV.</w:t>
       </w:r>
     </w:p>
     <w:p>
@@ -6243,7 +6154,7 @@
           <w:sz w:val="21"/>
           <w:szCs w:val="21"/>
         </w:rPr>
-        <w:t xml:space="preserve">Fig. 2 compares predicted and actual RUL for all 100 FD001 test engines, sorted by actual RUL. Predictions follow the actual values closely across the range, with the largest spread for engines with high RUL, where the engine still looks healthy and little degradation signal is present.</w:t>
+        <w:t xml:space="preserve">Fig. 2 compares predicted and actual RUL for all 100 FD001 test engines (seed 0, test RMSE 13.51). Predictions are tight for engines close to failure: the RMSE is 5.40 cycles for engines with fewer than 50 cycles left, against 13.09 for engines with 100 or more. This is the useful direction for maintenance, since accuracy matters most just before failure. Twelve of the 100 engines have an absolute error above 20 cycles, almost all in the mid and high RUL range, and 61% of predictions are later than the true value, which explains the PHM08 penalty discussed above.</w:t>
       </w:r>
     </w:p>
     <w:p>
@@ -6310,7 +6221,7 @@
           <w:sz w:val="16"/>
           <w:szCs w:val="16"/>
         </w:rPr>
-        <w:t xml:space="preserve">Predicted versus actual RUL for the FD001 test engines (CNN-LSTM with attention), sorted by actual RUL.</w:t>
+        <w:t xml:space="preserve">Predicted versus actual RUL for the FD001 test engines (CNN-LSTM with attention, seed 0), sorted by actual RUL.</w:t>
       </w:r>
     </w:p>
     <w:p>
@@ -6323,7 +6234,7 @@
           <w:sz w:val="21"/>
           <w:szCs w:val="21"/>
         </w:rPr>
-        <w:t xml:space="preserve">Fig. 3 follows a single test engine over its full life. The prediction stays near the 125-cycle cap during the healthy phase and then tracks the linear decline once degradation begins. Early in the decline the model tends to under-estimate RUL slightly, which is the safe direction for maintenance planning.</w:t>
+        <w:t xml:space="preserve">Fig. 3 follows held-out validation engine 2 over its full life of 287 cycles (validation engines, unlike test engines, run to failure). The prediction stays at the cap during the healthy phase, begins to fall around cycle 100, before the start of the labelled decline at cycle 162, and then tracks the decline to failure with an RMSE of 7.44 cycles. Declining early means the model warns before the label does, which is the safe direction.</w:t>
       </w:r>
     </w:p>
     <w:p>
@@ -6390,7 +6301,7 @@
           <w:sz w:val="16"/>
           <w:szCs w:val="16"/>
         </w:rPr>
-        <w:t xml:space="preserve">RUL prediction over the life of one FD001 test engine. The model follows the knee point where degradation becomes visible.</w:t>
+        <w:t xml:space="preserve">RUL prediction over the life of FD001 validation engine 2. The prediction falls slightly before the labelled knee point and then follows the linear decline.</w:t>
       </w:r>
     </w:p>
     <w:p>
@@ -6403,7 +6314,7 @@
           <w:sz w:val="21"/>
           <w:szCs w:val="21"/>
         </w:rPr>
-        <w:t xml:space="preserve">Fig. 4 shows training and validation loss for the proposed model. Both curves converge smoothly, and early stopping ends training before the validation loss starts to rise, indicating no significant over-fitting.</w:t>
+        <w:t xml:space="preserve">Fig. 4 shows training and validation loss of the proposed model. Both fall quickly in the first ten epochs and then level off together with no widening gap, so the model does not over-fit; early stopping restored the weights from the best validation epoch.</w:t>
       </w:r>
     </w:p>
     <w:p>
@@ -6470,7 +6381,87 @@
           <w:sz w:val="16"/>
           <w:szCs w:val="16"/>
         </w:rPr>
-        <w:t xml:space="preserve">Training and validation MSE loss of the CNN-LSTM with attention on FD001.</w:t>
+        <w:t xml:space="preserve">Training and validation MSE loss (log scale) of the CNN-LSTM with attention on FD001, seed 0.</w:t>
+      </w:r>
+    </w:p>
+    <w:p>
+      <w:pPr>
+        <w:spacing w:after="0" w:line="252"/>
+        <w:jc w:val="both"/>
+      </w:pPr>
+      <w:r>
+        <w:rPr>
+          <w:sz w:val="21"/>
+          <w:szCs w:val="21"/>
+        </w:rPr>
+        <w:t xml:space="preserve">Fig. 5 shows the mean attention weight per time step over all validation windows. The model places 76% of its attention on the current cycle and 89% on the last five, with almost no weight on cycles older than about fifteen steps. The LSTM state at the final step already summarises the history, so attention mostly acts as a learned read-out of that state with a small correction from the preceding cycles. This also explains why the gain over the plain LSTM is small.</w:t>
+      </w:r>
+    </w:p>
+    <w:p>
+      <w:pPr>
+        <w:keepNext w:val="false"/>
+        <w:spacing w:after="60" w:before="160"/>
+        <w:jc w:val="center"/>
+      </w:pPr>
+      <w:r>
+        <w:drawing>
+          <wp:inline distT="0" distB="0" distL="0" distR="0">
+            <wp:extent cx="5334000" cy="2133600"/>
+            <wp:effectExtent t="0" r="0" b="0" l="0"/>
+            <wp:docPr id="1" name="" descr="" title=""/>
+            <wp:cNvGraphicFramePr>
+              <a:graphicFrameLocks xmlns:a="http://schemas.openxmlformats.org/drawingml/2006/main" noChangeAspect="1"/>
+            </wp:cNvGraphicFramePr>
+            <a:graphic xmlns:a="http://schemas.openxmlformats.org/drawingml/2006/main">
+              <a:graphicData uri="http://schemas.openxmlformats.org/drawingml/2006/picture">
+                <pic:pic xmlns:pic="http://schemas.openxmlformats.org/drawingml/2006/picture">
+                  <pic:nvPicPr>
+                    <pic:cNvPr id="0" name="" descr=""/>
+                    <pic:cNvPicPr>
+                      <a:picLocks noChangeAspect="1" noChangeArrowheads="1"/>
+                    </pic:cNvPicPr>
+                  </pic:nvPicPr>
+                  <pic:blipFill>
+                    <a:blip r:embed="rId16" cstate="none"/>
+                    <a:srcRect/>
+                    <a:stretch>
+                      <a:fillRect/>
+                    </a:stretch>
+                  </pic:blipFill>
+                  <pic:spPr bwMode="auto">
+                    <a:xfrm>
+                      <a:off x="0" y="0"/>
+                      <a:ext cx="5334000" cy="2133600"/>
+                    </a:xfrm>
+                    <a:prstGeom prst="rect">
+                      <a:avLst/>
+                    </a:prstGeom>
+                  </pic:spPr>
+                </pic:pic>
+              </a:graphicData>
+            </a:graphic>
+          </wp:inline>
+        </w:drawing>
+      </w:r>
+    </w:p>
+    <w:p>
+      <w:pPr>
+        <w:spacing w:after="160"/>
+        <w:jc w:val="both"/>
+      </w:pPr>
+      <w:r>
+        <w:rPr>
+          <w:sz w:val="16"/>
+          <w:szCs w:val="16"/>
+        </w:rPr>
+        <w:t xml:space="preserve">Fig. 5. </w:t>
+      </w:r>
+      <w:r>
+        <w:rPr>
+          <w:sz w:val="16"/>
+          <w:szCs w:val="16"/>
+        </w:rPr>
+        <w:t xml:space="preserve">Mean attention weight per time step within the 30-cycle window (FD001 validation windows, seed 0).</w:t>
       </w:r>
     </w:p>
     <w:p>
@@ -6497,39 +6488,7 @@
           <w:sz w:val="21"/>
           <w:szCs w:val="21"/>
         </w:rPr>
-        <w:t xml:space="preserve">The results support three conclusions. First, temporal modelling matters: every sequence model beats the strongest non-sequential baseline under the same pipeline. Second, combining convolutional feature extraction with recurrent modelling and attention gives a consistent further gain at a modest cost in parameters (</w:t>
-      </w:r>
-      <w:r>
-        <w:rPr>
-          <w:sz w:val="21"/>
-          <w:szCs w:val="21"/>
-          <w:highlight w:val="yellow"/>
-          <w:highlightCs w:val="yellow"/>
-        </w:rPr>
-        <w:t xml:space="preserve">52 K</w:t>
-      </w:r>
-      <w:r>
-        <w:rPr>
-          <w:sz w:val="21"/>
-          <w:szCs w:val="21"/>
-        </w:rPr>
-        <w:t xml:space="preserve"> versus </w:t>
-      </w:r>
-      <w:r>
-        <w:rPr>
-          <w:sz w:val="21"/>
-          <w:szCs w:val="21"/>
-          <w:highlight w:val="yellow"/>
-          <w:highlightCs w:val="yellow"/>
-        </w:rPr>
-        <w:t xml:space="preserve">33 K</w:t>
-      </w:r>
-      <w:r>
-        <w:rPr>
-          <w:sz w:val="21"/>
-          <w:szCs w:val="21"/>
-        </w:rPr>
-        <w:t xml:space="preserve"> for the LSTM). Third, pre-processing choices such as the RUL cap influence error as much as architecture does, which is why a shared pipeline is necessary for a fair comparison.</w:t>
+        <w:t xml:space="preserve">The results support three conclusions. First, temporal modelling matters: every deep model beats both classical baselines on RMSE under the same pipeline, and the margin grows on the more complex FD003 subset. Second, the proposed CNN-LSTM with attention gives the lowest average error, but its gain over a well-trained LSTM is modest, and the LSTM is better on the safety-weighted PHM08 score. Where late warnings are costly, the plain LSTM is therefore a strong and simpler choice. Third, pre-processing choices such as the RUL cap change the error as much as the architecture does, so a shared pipeline is essential for a fair comparison.</w:t>
       </w:r>
     </w:p>
     <w:p>
@@ -6543,66 +6502,7 @@
           <w:sz w:val="21"/>
           <w:szCs w:val="21"/>
         </w:rPr>
-        <w:t xml:space="preserve">The study has limitations. C-MAPSS is simulated, and real fleets show sensor drift, missing data and maintenance events that the benchmark does not contain. The models produce point estimates without a measure of confidence, which a maintenance planner would need. These points motivate the future work below.</w:t>
-      </w:r>
-    </w:p>
-    <w:p>
-      <w:pPr>
-        <w:spacing w:after="120" w:before="240"/>
-        <w:jc w:val="center"/>
-      </w:pPr>
-      <w:r>
-        <w:rPr>
-          <w:smallCaps/>
-          <w:sz w:val="21"/>
-          <w:szCs w:val="21"/>
-        </w:rPr>
-        <w:t xml:space="preserve">V. Conclusion</w:t>
-      </w:r>
-    </w:p>
-    <w:p>
-      <w:pPr>
-        <w:spacing w:after="0" w:line="252"/>
-        <w:jc w:val="both"/>
-      </w:pPr>
-      <w:r>
-        <w:rPr>
-          <w:sz w:val="21"/>
-          <w:szCs w:val="21"/>
-        </w:rPr>
-        <w:t xml:space="preserve">This report presented a deep learning approach to predictive maintenance that estimates the Remaining Useful Life of turbofan engines from multivariate sensor data. Using one shared pipeline of sensor selection, normalisation, RUL capping and sliding windows, we compared two classical baselines with a 1D-CNN, a stacked LSTM and a hybrid CNN-LSTM with attention. The hybrid model achieved the best performance, with an RMSE of </w:t>
-      </w:r>
-      <w:r>
-        <w:rPr>
-          <w:sz w:val="21"/>
-          <w:szCs w:val="21"/>
-          <w:highlight w:val="yellow"/>
-          <w:highlightCs w:val="yellow"/>
-        </w:rPr>
-        <w:t xml:space="preserve">12.9</w:t>
-      </w:r>
-      <w:r>
-        <w:rPr>
-          <w:sz w:val="21"/>
-          <w:szCs w:val="21"/>
-        </w:rPr>
-        <w:t xml:space="preserve"> and a PHM08 score of </w:t>
-      </w:r>
-      <w:r>
-        <w:rPr>
-          <w:sz w:val="21"/>
-          <w:szCs w:val="21"/>
-          <w:highlight w:val="yellow"/>
-          <w:highlightCs w:val="yellow"/>
-        </w:rPr>
-        <w:t xml:space="preserve">271</w:t>
-      </w:r>
-      <w:r>
-        <w:rPr>
-          <w:sz w:val="21"/>
-          <w:szCs w:val="21"/>
-        </w:rPr>
-        <w:t xml:space="preserve"> on FD001, and the ablation study showed that the window length and the RUL cap are important design choices.</w:t>
+        <w:t xml:space="preserve">Training details also mattered as much as architecture. In a first run with unscaled RUL targets and a short early-stopping patience, two of three LSTM seeds collapsed to predicting the mean RUL (test RMSE above 40), and a 1D-CNN with global average pooling, which discards the position of each time step, performed worse than the Random Forest. Scaling the target to [0, 1], increasing the patience and flattening the convolutional output fixed both problems. These changes were checked on validation error only.</w:t>
       </w:r>
     </w:p>
     <w:p>
@@ -6616,7 +6516,48 @@
           <w:sz w:val="21"/>
           <w:szCs w:val="21"/>
         </w:rPr>
-        <w:t xml:space="preserve">Future work will extend the evaluation to the multi-condition subsets FD002 and FD004, test Transformer-based sequence models, add uncertainty estimation through Monte Carlo dropout or deep ensembles so that each prediction carries a confidence interval, validate on real industrial data, and deploy the model as a real-time monitoring dashboard.</w:t>
+        <w:t xml:space="preserve">The study has limitations. C-MAPSS is simulated, and real fleets show sensor drift, missing data and maintenance events that the benchmark does not contain. Only the single-condition subsets FD001 and FD003 were evaluated. The models give point estimates without a measure of confidence, which a maintenance planner would need, and the late-prediction rate (61% on FD001) shows that an explicit safety margin or an asymmetric loss would be needed in practice.</w:t>
+      </w:r>
+    </w:p>
+    <w:p>
+      <w:pPr>
+        <w:spacing w:after="120" w:before="240"/>
+        <w:jc w:val="center"/>
+      </w:pPr>
+      <w:r>
+        <w:rPr>
+          <w:smallCaps/>
+          <w:sz w:val="21"/>
+          <w:szCs w:val="21"/>
+        </w:rPr>
+        <w:t xml:space="preserve">V. Conclusion</w:t>
+      </w:r>
+    </w:p>
+    <w:p>
+      <w:pPr>
+        <w:spacing w:after="0" w:line="252"/>
+        <w:jc w:val="both"/>
+      </w:pPr>
+      <w:r>
+        <w:rPr>
+          <w:sz w:val="21"/>
+          <w:szCs w:val="21"/>
+        </w:rPr>
+        <w:t xml:space="preserve">This report presented a deep learning approach to predictive maintenance that estimates the Remaining Useful Life of turbofan engines from multivariate sensor data. Using one shared pipeline of sensor selection, normalisation, RUL capping and sliding windows, we compared two classical baselines with a 1D-CNN, a stacked LSTM and a hybrid CNN-LSTM with attention over five seeds. All deep models outperformed the baselines. The CNN-LSTM with attention achieved the lowest RMSE on both subsets (13.37 on FD001 and 11.88 on FD003), while the plain LSTM achieved the best PHM08 score (305 and 261), so the two recurrent models are the strongest candidates and the better choice depends on whether average error or late-prediction risk matters more. The ablation showed that 30 cycles of history are sufficient and that the RUL cap is as influential as the architecture.</w:t>
+      </w:r>
+    </w:p>
+    <w:p>
+      <w:pPr>
+        <w:spacing w:after="0" w:line="252"/>
+        <w:ind w:firstLine="202"/>
+        <w:jc w:val="both"/>
+      </w:pPr>
+      <w:r>
+        <w:rPr>
+          <w:sz w:val="21"/>
+          <w:szCs w:val="21"/>
+        </w:rPr>
+        <w:t xml:space="preserve">Future work will extend the evaluation to the multi-condition subsets FD002 and FD004, train with an asymmetric loss that directly penalises late predictions, test Transformer-based sequence models, add uncertainty estimation through Monte Carlo dropout or deep ensembles so that each prediction carries a confidence interval, validate on real industrial data, and deploy the model as a real-time monitoring dashboard.</w:t>
       </w:r>
     </w:p>
     <w:p>

</xml_diff>

<commit_message>
Report: keep team's edited text, restore original formatting
Text extracted verbatim from the team's edited .docx into
report/edited_content.json; build_report_edited.js lays it out with the
original template (headings, justified body, lists, captions, tables).

Co-Authored-By: Claude Opus 5.5 <noreply@anthropic.com>
Claude-Session: https://claude.ai/code/session_01CagGZ3MZ5RKTUY41265D1Q
</commit_message>
<xml_diff>
--- a/report/DL_ESE_Project_Report_Predictive_Maintenance.docx
+++ b/report/DL_ESE_Project_Report_Predictive_Maintenance.docx
@@ -551,7 +551,7 @@
           <w:sz w:val="18"/>
           <w:szCs w:val="18"/>
         </w:rPr>
-        <w:t xml:space="preserve">Unplanned equipment failure is one of the largest sources of downtime and safety risk in aviation, manufacturing and energy systems. Predictive maintenance (PdM) replaces fixed service intervals with decisions based on the measured health of a machine, and its central quantity is the Remaining Useful Life (RUL): the number of operating cycles left before failure. This report presents a deep learning pipeline that estimates RUL directly from multivariate time-series sensor data, evaluated on the NASA C-MAPSS turbofan engine benchmark. Raw sensor streams are filtered to 14 informative channels, min-max normalised, labelled with a piece-wise linear RUL target capped at 125 cycles and converted into 30-cycle sliding windows. Under one shared pipeline we compare two classical baselines (Linear Regression and Random Forest) with three deep models: a 1D Convolutional Neural Network (1D-CNN), a stacked Long Short-Term Memory (LSTM) network, and a hybrid CNN-LSTM with additive temporal attention. Models are scored with Root Mean Squared Error (RMSE) and the asymmetric PHM08 score, which penalises late predictions more than early ones, averaged over five seeds. The CNN-LSTM with attention achieves the lowest RMSE on both subsets studied: 13.37 cycles on FD001 and 11.88 on FD003, against 14.99 and 16.26 for the best classical baseline. The plain LSTM, however, obtains the best PHM08 score on both subsets, and on FD001 the gap between the two recurrent models is within seed-to-seed variation. An ablation shows that the RUL cap affects error as much as the choice of architecture, and attention analysis shows that the model places 76% of its weight on the most recent cycle of each window.</w:t>
+        <w:t xml:space="preserve">Unplanned equipment failure is one of the biggest sources of both downtime and safety risk in aviation, manufacturing and the energy sector. Predictive maintenance (PdM) replaces the traditional fixed interval maintenance with maintenance decisions based on the actual measured health of the machine. The key quantity in PdM is the Remaining Useful Life (RUL) of the asset which is the number of operating cycles that remain before failure. This report details a deep learning pipeline for the direct estimation of RUL from multivariate time-series sensor data, tested on the NASA C-MAPSS turbofan engine dataset. The raw sensor streams are filtered down to 14 informative channels, min-max normalised, the RUL is labelled using a piece-wise linear function with a hard cap at 125 cycles and the data is then converted into 30 cycle sliding windows. A single shared pipeline is used to compare two classical baselines (Linear Regression and Random Forest) with three deep learning models: a 1D Convolutional Neural Network (1D-CNN), a stacked Long Short Term Memory (LSTM) network and a hybrid CNN-LSTM with additive temporal attention. Models are evaluated using Root Mean Squared Error (RMSE) and the asymmetric PHM08 score (which penalises late predictions more than early ones), averaged over five seeds. The CNN-LSTM with attention achieves the lowest RMSE on both of the subsets considered (13.37 cycles on FD001 and 11.88 on FD003) compared to 14.99 and 16.26 for the best performing classical baseline. The plain LSTM however achieves the best PHM08 score on both subsets and on FD001 the difference between the two recurrent models is within the range of seed to seed variation. An ablation study shows that the RUL cap has as much of an effect on the error as the choice of architecture and attention analysis shows that the model is placing 76% of its weight on the most recent cycle in each window.</w:t>
       </w:r>
     </w:p>
     <w:p>
@@ -600,7 +600,7 @@
           <w:sz w:val="21"/>
           <w:szCs w:val="21"/>
         </w:rPr>
-        <w:t xml:space="preserve">Industrial maintenance usually follows one of three strategies. Reactive maintenance repairs a machine only after it breaks, which leads to long and expensive downtime. Preventive maintenance services machines at fixed intervals, which is safer but throws away the remaining life of healthy parts. Predictive maintenance monitors the actual condition of the asset through sensors and intervenes only when degradation is detected. Low-cost sensing and Industry 4.0 data platforms now produce continuous streams of temperature, pressure, vibration and speed readings, which makes data-driven predictive maintenance practical at scale.</w:t>
+        <w:t xml:space="preserve">Industrial maintenance generally adopts one of three approaches. In the case of reactive maintenance, a machine is repaired only after it has broken down, causing lengthy and costly periods of downtime. Preventive maintenance involves servicing machines on a fixed schedule, an approach that is safer but fails to make use of the remaining life of parts that are still in good condition. Predictive maintenance keeps track of the actual condition of the asset by means of sensors and takes action only when deterioration is detected. Because low-cost sensing devices and Industry 4.0 data platforms are now capable of generating continuous streams of data on temperature, pressure, vibration and speed, data-driven predictive maintenance has become practical on a large scale.</w:t>
       </w:r>
     </w:p>
     <w:p>
@@ -614,7 +614,7 @@
           <w:sz w:val="21"/>
           <w:szCs w:val="21"/>
         </w:rPr>
-        <w:t xml:space="preserve">The key quantity in predictive maintenance is the Remaining Useful Life (RUL) of a component. Estimating RUL from multivariate sensor data is hard for four reasons. Sensors are noisy and strongly correlated with each other. Readings shift with operating conditions such as altitude and throttle setting, independently of wear. Degradation is gradual and non-linear, and it is barely visible in the early life of a machine. Finally, an error in one direction matters more than the other: predicting failure too late can be catastrophic, while predicting it too early only costs a slightly premature repair.</w:t>
+        <w:t xml:space="preserve">The most important quantity in the context of predictive maintenance is the Remaining Useful Life (RUL) of a component. It is difficult to estimate the RUL from multivariate sensor data for the following four reasons. The sensors are noisy and highly correlated with one another. The readings change with operating conditions such as altitude and throttle position, regardless of any wear that has occurred. The degradation process is gradual and non-linear, and it is only just noticeable during the early stages of a machine's life. Lastly, an error in one direction is more significant than in the other: it is catastrophic if failure is predicted too late, while predicting failure too early results in only a slightly premature repair.</w:t>
       </w:r>
     </w:p>
     <w:p>
@@ -628,7 +628,7 @@
           <w:sz w:val="21"/>
           <w:szCs w:val="21"/>
         </w:rPr>
-        <w:t xml:space="preserve">Deep learning models learn temporal features directly from raw sequences, removing much of the manual feature engineering that classical prognostics depends on. Convolutional networks capture short local patterns across sensors, while recurrent networks such as the LSTM model the longer trend of degradation over many cycles. This project studies how far these models improve on classical baselines when every model is trained under the same pre-processing and evaluation protocol.</w:t>
+        <w:t xml:space="preserve">Deep learning models are able to learn temporal features directly from the raw sequences, thereby eliminating a large part of the manual feature engineering which classical prognostics relies upon. Convolutional networks pick up on short, local patterns from the various sensors, whereas recurrent networks such as the LSTM deal with the longer trend of degradation that occurs over many cycles. The aim of this project is to find out how much better these models perform compared to classical baseline methods when all of the models are trained using the same pre-processing and evaluation protocol.</w:t>
       </w:r>
     </w:p>
     <w:p>
@@ -655,7 +655,7 @@
           <w:sz w:val="21"/>
           <w:szCs w:val="21"/>
         </w:rPr>
-        <w:t xml:space="preserve">Given the multivariate sensor history of an engine up to its current cycle, predict the number of cycles remaining before failure, as accurately as possible and with a preference for early rather than late errors.</w:t>
+        <w:t xml:space="preserve">On the basis of the multivariate sensor history of the engine up to and including the present cycle, predict as accurately as possible how many cycles remain before failure, giving priority to early rather than late errors.</w:t>
       </w:r>
     </w:p>
     <w:p>
@@ -687,7 +687,7 @@
           <w:sz w:val="21"/>
           <w:szCs w:val="21"/>
         </w:rPr>
-        <w:t xml:space="preserve">Build a reproducible pre-processing pipeline for C-MAPSS: sensor selection, condition-wise normalisation, RUL capping and sliding-window generation.</w:t>
+        <w:t xml:space="preserve">Create a reproducible pre-processing pipeline for C-MAPSS which includes sensor selection, condition-wise normalisation, RUL capping and the generation of sliding windows.</w:t>
       </w:r>
     </w:p>
     <w:p>
@@ -705,7 +705,7 @@
           <w:sz w:val="21"/>
           <w:szCs w:val="21"/>
         </w:rPr>
-        <w:t xml:space="preserve">Implement and train three deep learning models (1D-CNN, LSTM, and CNN-LSTM with attention) for RUL regression.</w:t>
+        <w:t xml:space="preserve">Implement the 1D-CNN, LSTM, and CNN-LSTM with attention models and train them for the purpose of RUL regression.</w:t>
       </w:r>
     </w:p>
     <w:p>
@@ -723,7 +723,7 @@
           <w:sz w:val="21"/>
           <w:szCs w:val="21"/>
         </w:rPr>
-        <w:t xml:space="preserve">Compare them against Linear Regression and Random Forest baselines using RMSE and the PHM08 score.</w:t>
+        <w:t xml:space="preserve">Compare these [methods] with the Linear Regression and Random Forest baseline models using the RMSE and the PHM08 score.</w:t>
       </w:r>
     </w:p>
     <w:p>
@@ -741,7 +741,7 @@
           <w:sz w:val="21"/>
           <w:szCs w:val="21"/>
         </w:rPr>
-        <w:t xml:space="preserve">Study the effect of key design choices (window length and RUL cap) and interpret model behaviour with prediction trajectories and attention weights.</w:t>
+        <w:t xml:space="preserve">Examine the impact of the main design options (window length and RUL cap) and understand the model's behaviour by using the prediction trajectories and the attention weights.</w:t>
       </w:r>
     </w:p>
     <w:p>
@@ -768,7 +768,7 @@
           <w:sz w:val="21"/>
           <w:szCs w:val="21"/>
         </w:rPr>
-        <w:t xml:space="preserve">The study uses the simulated NASA C-MAPSS dataset and focuses on point estimates of RUL. Section II reviews related work. Section III describes the dataset, pre-processing, model architectures and training setup. Section IV presents quantitative and qualitative results with a comparative study. Section V concludes and outlines future work.</w:t>
+        <w:t xml:space="preserve">The study makes use of the simulated NASA C-MAPSS dataset and is concerned with point estimates of the remaining useful life. Section II provides a review of previous work. Section III outlines the dataset, the pre-processing steps, the model architectures and the training setup. Section IV gives a presentation of both quantitative and qualitative results together with a comparative study. Section V draws the study to a close and suggests some future research.</w:t>
       </w:r>
     </w:p>
     <w:p>
@@ -782,7 +782,7 @@
           <w:sz w:val="21"/>
           <w:szCs w:val="21"/>
         </w:rPr>
-        <w:t xml:space="preserve">II. Literature Review</w:t>
+        <w:t xml:space="preserve">II. LITERATURE REVIEW</w:t>
       </w:r>
     </w:p>
     <w:p>
@@ -809,7 +809,7 @@
           <w:sz w:val="21"/>
           <w:szCs w:val="21"/>
         </w:rPr>
-        <w:t xml:space="preserve">Early prognostics relied on physics-based degradation models and statistical approaches such as similarity-based matching and regression on hand-crafted health indicators. Lei et al. [1] review the complete prognostics pipeline, from data acquisition and health-indicator construction to RUL prediction, and observe that data-driven methods are preferred whenever an accurate physical model of the asset is unavailable. Carvalho et al. [2] survey machine learning for predictive maintenance and report that Random Forests, Support Vector Machines and artificial neural networks are the most frequently used techniques.</w:t>
+        <w:t xml:space="preserve">Initial prognostics employed physics-based degradation modeling or statistical techniques such as similarity-based matching and regression based on manually defined health-indicator sets. Lei et al. [1] consider data-driven approaches and describe the prognosis pipeline, from data collection through health indicator creation to RUL prediction; Lei et al. [1] conclude that data-driven approaches are used if there is no sufficiently accurate physical model of the asset. Carvalho et al. [2] review machine learning for predictive maintenance and find that Random Forests, Support Vector Machines and neural networks are most commonly employed.</w:t>
       </w:r>
     </w:p>
     <w:p>
@@ -836,7 +836,7 @@
           <w:sz w:val="21"/>
           <w:szCs w:val="21"/>
         </w:rPr>
-        <w:t xml:space="preserve">Saxena et al. [3] created the C-MAPSS dataset by simulating damage propagation in turbofan engines under varying operating conditions and fault modes, and it has since become the standard benchmark for RUL estimation. Ramasso and Saxena [4] analysed the methods applied to it and stressed that results are only comparable when pre-processing and metrics are consistent, introducing the PHM08 score as a common measure alongside RMSE.</w:t>
+        <w:t xml:space="preserve">Saxena et al. [3] by simulating damage spread over a turbofan engine in various operational and fault settings, is now the benchmark for RUL estimation. Ramasso and Saxena [4] investigated the techniques used on it and emphasised that the only fair comparison is done when the metrics and pre-processing are harmonised, and adapted the PHM08 score as a common metric alongside RMSE.</w:t>
       </w:r>
     </w:p>
     <w:p>
@@ -850,7 +850,7 @@
           <w:sz w:val="21"/>
           <w:szCs w:val="21"/>
         </w:rPr>
-        <w:t xml:space="preserve">C. Convolutional Approaches</w:t>
+        <w:t xml:space="preserve">C. Convolutional Techniques</w:t>
       </w:r>
     </w:p>
     <w:p>
@@ -863,7 +863,7 @@
           <w:sz w:val="21"/>
           <w:szCs w:val="21"/>
         </w:rPr>
-        <w:t xml:space="preserve">Heimes [5] applied recurrent neural networks to the 2008 PHM challenge, an early demonstration of neural models for this task. Babu et al. [6] were among the first to use a deep CNN for RUL regression, treating windows of sensor readings as two-dimensional inputs and outperforming shallow regressors. Li et al. [7] extended this with a deeper one-dimensional CNN over time windows, achieving strong results on all four C-MAPSS subsets without hand-crafted features.</w:t>
+        <w:t xml:space="preserve">Weights [5] used recurrent neural networks for the 2008 PHM challenge, showing the feasibility of neural models on this problem. Babu et al. [6] were the first to use deep CNNs to perform RUL regression, using 2D windows of sensor readings and doing better than shallow regressors. Li et al. [7] build even deeper one-dimensional CNNs over windows of time, performing well on all four C-MAPSS subsets without any feature engineering.</w:t>
       </w:r>
     </w:p>
     <w:p>
@@ -877,7 +877,7 @@
           <w:sz w:val="21"/>
           <w:szCs w:val="21"/>
         </w:rPr>
-        <w:t xml:space="preserve">D. Recurrent and Attention-Based Approaches</w:t>
+        <w:t xml:space="preserve">D. Recurrent and Attention Based Methods</w:t>
       </w:r>
     </w:p>
     <w:p>
@@ -890,7 +890,7 @@
           <w:sz w:val="21"/>
           <w:szCs w:val="21"/>
         </w:rPr>
-        <w:t xml:space="preserve">Because degradation is a temporal process, recurrent models are a natural fit. The LSTM [8] uses gated memory cells to avoid the vanishing gradients of plain recurrent networks and can capture long-range dependencies. Zheng et al. [9] showed that stacked LSTM layers estimate RUL more accurately than CNN and classical baselines on C-MAPSS. Malhotra et al. [10] used an LSTM encoder-decoder for unsupervised anomaly detection on multi-sensor data, showing that reconstruction error can serve as a health indicator. The attention mechanism [11] lets a model weight the most informative time steps, and hybrid CNN-LSTM models with attention have been reported to improve both accuracy and interpretability.</w:t>
+        <w:t xml:space="preserve">As degradation is a time-dependent phenomenon, a recurrent architecture is a natural choice. LSTM [8] are recurrent LSTM units with gates that address the vanishing gradient problem of plain RNNs and are able to model long-range dependencies. Zheng et al [9] demonstrated that stacked LSTM layers outperform CNN and classical baselines in RUL estimation on C-MAPSS. Malhotra et al [10] used an LSTM encoder-decoder architecture for unsupervised anomaly detection on multi-sensor data; their study demonstrated that reconstruction error can be used as a health indicator. The attention mechanism [11] allows the model to assign higher weights to relevant time-steps. Hybrid CNN-LSTM models with attention have been shown to outperform plain RNN or CNN baselines in both accuracy and interpretability.</w:t>
       </w:r>
     </w:p>
     <w:p>
@@ -904,7 +904,7 @@
           <w:sz w:val="21"/>
           <w:szCs w:val="21"/>
         </w:rPr>
-        <w:t xml:space="preserve">E. Research Gap</w:t>
+        <w:t xml:space="preserve">E. Gap in Research</w:t>
       </w:r>
     </w:p>
     <w:p>
@@ -917,7 +917,7 @@
           <w:sz w:val="21"/>
           <w:szCs w:val="21"/>
         </w:rPr>
-        <w:t xml:space="preserve">Most studies report a single model, often on a single subset and with different pre-processing choices, which makes it hard to tell whether gains come from the architecture or from the pipeline. This project trains classical and deep models under one shared pipeline (the same sensors, normalisation, windows, RUL cap and metrics), adds an ablation of window length and RUL cap, and pairs the numbers with qualitative error analysis. Table I summarises the most relevant prior work.</w:t>
+        <w:t xml:space="preserve">Few studies use more than one model, on one subset, with different pre-processing choices; this makes it difficult to quantify whether any gain is from the architecture or the pipeline. This project trains classical and deep models with one shared pipeline (measurements, normalisation, window, RUL cap, metrics), includes an ablation of the window length and RUL cap, and pairs the numbers with qualitative error analysis. Table I summarises the most relevant previous work.</w:t>
       </w:r>
     </w:p>
     <w:p>
@@ -1903,7 +1903,7 @@
           <w:sz w:val="21"/>
           <w:szCs w:val="21"/>
         </w:rPr>
-        <w:t xml:space="preserve">A. System Overview</w:t>
+        <w:t xml:space="preserve">A. System Description</w:t>
       </w:r>
     </w:p>
     <w:p>
@@ -1916,7 +1916,7 @@
           <w:sz w:val="21"/>
           <w:szCs w:val="21"/>
         </w:rPr>
-        <w:t xml:space="preserve">Fig. 1 shows the complete pipeline. Raw sensor readings are cleaned and normalised, cut into fixed-length windows, passed to a learned model that outputs an RUL estimate, and finally compared with a maintenance threshold to decide whether service should be scheduled.</w:t>
+        <w:t xml:space="preserve">Fig. 1. Full pipeline: sensor data are pre-processed and segmented, fed to a learned model that predicts an RUL, and, finally, sent to a thresholding rule that determines whether to schedule maintenance.</w:t>
       </w:r>
     </w:p>
     <w:p>
@@ -2010,7 +2010,7 @@
           <w:sz w:val="21"/>
           <w:szCs w:val="21"/>
         </w:rPr>
-        <w:t xml:space="preserve">We use the NASA Commercial Modular Aero-Propulsion System Simulation (C-MAPSS) dataset [3]. Each engine starts in a healthy state with unknown manufacturing variation and initial wear, and degrades until failure. Each row is one operating cycle and contains the engine identifier, the cycle number, three operational settings and 21 sensor readings covering temperatures, pressures, fan and core speeds, and fuel-flow ratios. In the training set every engine runs to failure; in the test set the series stops some time before failure, and the true RUL at the last cycle is provided separately. Table II lists the four subsets. FD001 is used as the primary benchmark and FD003 for a second comparison.</w:t>
+        <w:t xml:space="preserve">We use the NASA Commercial Modular Aero-Propulsion System Simulation (C-MAPSS) dataset [3]. All engines are started in a healthy condition with unknown manufacturing variation and initial degradation, and run until failure. Each row is a single operating cycle and includes the engine id, cycle id, operational settings and 21 sensor values (temperatures, pressures, fan and core speed, and fuel-flow ratio). Both the training set, in which each engine ends in failure, and the test set, which terminates some time before failure, are comprised of four subsets. The latter includes only the final, unsuccessful segment of each engine, and the (unknown) RUL at the end of that segment. FD001 is the primary benchmark, while FD003 is used for additional comparison.</w:t>
       </w:r>
     </w:p>
     <w:p>
@@ -2907,7 +2907,7 @@
           <w:sz w:val="21"/>
           <w:szCs w:val="21"/>
         </w:rPr>
-        <w:t xml:space="preserve">Seven sensors that are constant or nearly constant in FD001 (s1, s5, s6, s10, s16, s18, s19) are dropped, leaving 14 informative channels.</w:t>
+        <w:t xml:space="preserve">Seven sensors are constant or almost constant for the time series of FD001 (s1, s5, s6, s10, s16, s18, s19) and are removed so that 14 channels contain all information.</w:t>
       </w:r>
     </w:p>
     <w:p>
@@ -2934,7 +2934,7 @@
           <w:sz w:val="21"/>
           <w:szCs w:val="21"/>
         </w:rPr>
-        <w:t xml:space="preserve">Min-max scaling to [0, 1] is fitted on the training engines only, and applied per operating condition for the multi-condition subsets.</w:t>
+        <w:t xml:space="preserve">Min-max scaling to [0, 1] is fitted on the training engines only. Per operating condition for the multi-condition subsets.</w:t>
       </w:r>
     </w:p>
     <w:p>
@@ -2961,7 +2961,7 @@
           <w:sz w:val="21"/>
           <w:szCs w:val="21"/>
         </w:rPr>
-        <w:t xml:space="preserve">RUL = last cycle - current cycle, clipped at 125 cycles. This piece-wise linear target reflects that degradation is not observable early in an engine's life.</w:t>
+        <w:t xml:space="preserve">RUL = last cycle - current cycle, clipped at 125 cycles This piece-wise linear target shows that damage is un observable for part of the engine's life.</w:t>
       </w:r>
     </w:p>
     <w:p>
@@ -2988,7 +2988,7 @@
           <w:sz w:val="21"/>
           <w:szCs w:val="21"/>
         </w:rPr>
-        <w:t xml:space="preserve">Sliding windows of 30 cycles with stride 1 give inputs of shape 30 x 14. For the test set the last window of each engine is used.</w:t>
+        <w:t xml:space="preserve">Sliding windows of 30 cycles stride 1 provide windows of 30 x 14 as input. For the test set the last window of each engine is used.</w:t>
       </w:r>
     </w:p>
     <w:p>
@@ -3015,7 +3015,7 @@
           <w:sz w:val="21"/>
           <w:szCs w:val="21"/>
         </w:rPr>
-        <w:t xml:space="preserve">20% of training engines, split by engine ID so that no engine appears in both sets, are held out for early stopping and tuning.</w:t>
+        <w:t xml:space="preserve">Out of sample 20% of the training engines (by engine id so that an engine does not appear in both sets) are held out for early stopping and tuning.</w:t>
       </w:r>
     </w:p>
     <w:p>
@@ -3051,7 +3051,7 @@
           <w:sz w:val="21"/>
           <w:szCs w:val="21"/>
         </w:rPr>
-        <w:t xml:space="preserve">Linear Regression and a Random Forest Regressor (200 trees, minimum 5 samples per leaf) are trained on flattened windows, giving a reference point without temporal modelling.</w:t>
+        <w:t xml:space="preserve">Linear Regression and a Random Forest Regressor (200 trees with 5 samples in each leaf) are trained on flattened windows, as a middle point between nothing and models that are aware of time.</w:t>
       </w:r>
     </w:p>
     <w:p>
@@ -3074,7 +3074,7 @@
           <w:sz w:val="21"/>
           <w:szCs w:val="21"/>
         </w:rPr>
-        <w:t xml:space="preserve">Two Conv1D layers (64 filters, kernel sizes 5 and 3, ReLU) extract local patterns across time and sensors, whose output is flattened (keeping the position of each time step) and passed to a 64-unit dense layer, dropout of 0.3 and a single linear output.</w:t>
+        <w:t xml:space="preserve">Two Conv1D layers (64 filters, kernel sizes 5 and 3, ReLU) capture local structure both along time and sensors, flattened output (preserving the time locations) for a dense layer with 64 units, dropout 0.3 and a single linear output.</w:t>
       </w:r>
     </w:p>
     <w:p>
@@ -3097,7 +3097,7 @@
           <w:sz w:val="21"/>
           <w:szCs w:val="21"/>
         </w:rPr>
-        <w:t xml:space="preserve">Two stacked LSTM layers with 64 and 32 units model the degradation trend over the window, followed by dropout of 0.2, a 32-unit dense layer and a linear output.</w:t>
+        <w:t xml:space="preserve">Two stacked LSTM layers with 64 and 32 units, the degradation trend across the window, followed by dropout of 0.2, a 32-unit dense layer and a linear output.</w:t>
       </w:r>
     </w:p>
     <w:p>
@@ -3120,7 +3120,7 @@
           <w:sz w:val="21"/>
           <w:szCs w:val="21"/>
         </w:rPr>
-        <w:t xml:space="preserve">A Conv1D block (64 filters, kernel 3) first extracts local features at each time step. An LSTM layer (64 units, returning the full sequence) encodes temporal dependencies. A Bahdanau-style additive attention layer then computes a weight for each of the 30 time steps and forms a context vector as their weighted sum, which a dense regression head maps to the RUL estimate. The attention weights also make the model's focus inspectable.</w:t>
+        <w:t xml:space="preserve">Each local feature at the individual time step is extracted using a Conv1D block (64 filters, kernel 3) and an LSTM layer (64 units, return sequences=True). For encoding long-term time dependencies, a Bahdanau-style additive attention layer generates a weight for each of the 30 time steps, and builds a context vector as the weighted mean of these vectors. This context vector is then mapped to the RUL label using a dense regression head.</w:t>
       </w:r>
     </w:p>
     <w:p>
@@ -3147,7 +3147,7 @@
           <w:sz w:val="21"/>
           <w:szCs w:val="21"/>
         </w:rPr>
-        <w:t xml:space="preserve">All deep models are trained with the settings in Table III. Each configuration is trained with five random seeds (model initialisation and batch order) on a fixed engine-level train/validation split, and we report the mean and standard deviation. Linear Regression is deterministic, so it is run once.</w:t>
+        <w:t xml:space="preserve">All deep models are trained with the hyperparameters in Table III. They are trained with five random seeds (initialisation of model parameters and the order of the training set) on a fixed engine-level train/validation split, and we report the mean and standard deviation. Since Linear Regression is deterministic, we run it only once.</w:t>
       </w:r>
     </w:p>
     <w:p>
@@ -3830,7 +3830,7 @@
           <w:sz w:val="21"/>
           <w:szCs w:val="21"/>
         </w:rPr>
-        <w:t xml:space="preserve">Let d = RUL_pred - RUL_true for each test engine. Root Mean Squared Error, RMSE = sqrt( (1/N) Σ d² ), penalises early and late errors equally.</w:t>
+        <w:t xml:space="preserve">For each test engine, define d = RULpred - RULtrue. Root Mean Squared Error, RMSE = SQRT ( ( 1/N ) (sum of the squares of the differences). RMSE treats early and late errors the same.</w:t>
       </w:r>
     </w:p>
     <w:p>
@@ -3844,7 +3844,7 @@
           <w:sz w:val="21"/>
           <w:szCs w:val="21"/>
         </w:rPr>
-        <w:t xml:space="preserve">The PHM08 score [3], s = Σ (e^(-d/13) - 1) for d &lt; 0 and Σ (e^(d/10) - 1) for d ≥ 0, grows faster for late predictions (d &gt; 0) because they are more dangerous in practice. Lower values are better for both metrics.</w:t>
+        <w:t xml:space="preserve">The PHM08 score [3] s = Σ ( e - 1) for d 0 = (e () 1)/13 for d 0 outpace in the growth the other score as they carry a higher risk in the real world. The worse a score, the more risk is carried, either way.</w:t>
       </w:r>
     </w:p>
     <w:p>
@@ -3858,7 +3858,7 @@
           <w:sz w:val="21"/>
           <w:szCs w:val="21"/>
         </w:rPr>
-        <w:t xml:space="preserve">IV. Results and Discussion</w:t>
+        <w:t xml:space="preserve">IV. RESULTS AND DISCUSSION</w:t>
       </w:r>
     </w:p>
     <w:p>
@@ -3885,7 +3885,7 @@
           <w:sz w:val="21"/>
           <w:szCs w:val="21"/>
         </w:rPr>
-        <w:t xml:space="preserve">Table IV reports test-set performance on FD001 and FD003. Deep models and the Random Forest are averaged over five seeds; Linear Regression is deterministic and run once. Params is the number of trainable parameters.</w:t>
+        <w:t xml:space="preserve">Table IV - Test-set performance on FD001 and FD003 FD001 and FD003 are reported with each type of model trained over five different seeds; single seed training of Linear Regression. Params is number of trainable parameters.</w:t>
       </w:r>
     </w:p>
     <w:p>
@@ -5094,6 +5094,7 @@
     <w:p>
       <w:pPr>
         <w:spacing w:after="0" w:line="252"/>
+        <w:ind w:firstLine="202"/>
         <w:jc w:val="both"/>
       </w:pPr>
       <w:r>
@@ -5101,7 +5102,7 @@
           <w:sz w:val="21"/>
           <w:szCs w:val="21"/>
         </w:rPr>
-        <w:t xml:space="preserve">All three deep models outperform both classical baselines on RMSE. The proposed CNN-LSTM with attention has the lowest RMSE on both subsets: 13.37 ± 0.35 on FD001 and 11.88 ± 0.70 on FD003. This is 10.8% and 26.9% lower than Linear Regression, the stronger of the two baselines, and 2.0% and 3.9% lower than the plain LSTM.</w:t>
+        <w:t xml:space="preserve">All three deep models outperform both classical baselines on RMSE. CNN-LSTM with attention results in the lowest RMSE for both data subsets, 13.37 ± 0.35 for FD001 and 11.88 ± 0.70 for FD003. The results are 10.8% and 26.9% lower than those of the stronger classical baseline model, Linear Regression, and 2.0% and 3.9% lower than those of the plain LSTM model.</w:t>
       </w:r>
     </w:p>
     <w:p>
@@ -5115,7 +5116,7 @@
           <w:sz w:val="21"/>
           <w:szCs w:val="21"/>
         </w:rPr>
-        <w:t xml:space="preserve">Two results differ from what we expected. First, Linear Regression beats the Random Forest on both subsets (14.99 against 15.91 on FD001). A likely reason is that the flattened input has 420 strongly correlated features, which suits a linear model, while tree ensembles predict averages of training targets and tend to pull extreme RUL values towards the middle. Second, the plain LSTM, not the proposed model, has the best PHM08 score on both subsets (305 on FD001 and 261 on FD003). Since PHM08 punishes late predictions exponentially, this means the LSTM makes fewer large late errors even though its average error is slightly higher. On FD001 the RMSE gap between the two recurrent models (0.27 cycles) is smaller than the LSTM's own seed-to-seed standard deviation (0.52), so the two should be regarded as comparable there; on FD003 the gap is larger.</w:t>
+        <w:t xml:space="preserve">Two results are surprising, then. Firstly, the linear regression beats the random forest on both sets (15.91, 14.99 on FD001). This is probably because the flattened input has 420 correlated features, a linear model that can efficiently use this, while the random forests, and all the other tree ensembles, predict means of training targets and are thus prone to pull the big and little RULs of the extreme trajectories towards the middle. Secondly, the model with an LSTM layer instead of the other recurrent layer (but not the plain LSTM model, which scores lower on PHM08 on both sets 305,261) has the best PHM08 score on both sets (261,305). Since PHM08 penalizes late predictions exponentially, this score is best if the model makes fewer large late errors, even though the average error is slightly higher. On FD001, the RMSE difference between the two recurrent models (0.27 cycles) is smaller than the LSTM's seed-to-seed standard deviation (0.52) and the other seed-to-seed variation (0.51), so these two could be considered roughly equal there; on FD003, it is larger.</w:t>
       </w:r>
     </w:p>
     <w:p>
@@ -5129,7 +5130,7 @@
           <w:sz w:val="21"/>
           <w:szCs w:val="21"/>
         </w:rPr>
-        <w:t xml:space="preserve">The advantage of the deep models is larger on FD003, which contains two fault modes. Linear Regression and the Random Forest lose 1.3 to 1.5 cycles of RMSE from FD001 to FD003, while the recurrent models improve, suggesting that sequence models cope better with more varied degradation patterns. FD003 also has more training windows (17,273 against 13,980), which benefits the larger models.</w:t>
+        <w:t xml:space="preserve">The performance gap is biggest for the models here on FD003, which suffers from two types of faults. Both the Linear Regression and Random Forest regressors degrade by about 1.3 to 1.5 cycles of RMSE from FD001 to FD003 while the recurrent models do well and much better than the regressors indicating that sequence models handle multiple fault modes better. Much more training windows are available for this benchmark (17,273 vs. 13,980).</w:t>
       </w:r>
     </w:p>
     <w:p>
@@ -5156,7 +5157,7 @@
           <w:sz w:val="21"/>
           <w:szCs w:val="21"/>
         </w:rPr>
-        <w:t xml:space="preserve">Table V varies the window length and RUL cap for the proposed model on FD001 while keeping all other settings fixed (mean ± std over three seeds). To keep rows comparable, every setting is scored against the same target, the true RUL capped at 125 cycles.</w:t>
+        <w:t xml:space="preserve">Table V – different window length &amp; RUL cap for the model in Table I, on FD001 (mean ± std. Over three seeds). All other parameters are fixed. We apply the same scoring target for each row to enable a fair comparison for every setting (RUL_true capped at 125).</w:t>
       </w:r>
     </w:p>
     <w:p>
@@ -6120,6 +6121,7 @@
     <w:p>
       <w:pPr>
         <w:spacing w:after="0" w:line="252"/>
+        <w:ind w:firstLine="202"/>
         <w:jc w:val="both"/>
       </w:pPr>
       <w:r>
@@ -6127,7 +6129,7 @@
           <w:sz w:val="21"/>
           <w:szCs w:val="21"/>
         </w:rPr>
-        <w:t xml:space="preserve">A 20-cycle window is clearly too short (RMSE 15.96), while 30 and 40 cycles perform almost identically (13.31 and 13.49), so 30 cycles is a sufficient history. The RUL cap matters more. Training without a cap is by far the worst setting (RMSE 28.30): the model learns to predict values well above 125 for healthy engines, which it cannot justify from sensor data. A cap of 115 gives a lower error than 125 (12.66 against 13.31), and 130 a higher one (14.58). Part of this effect comes from scoring every row against the cap-125 target, which favours models whose predictions stay below 125. We keep 125 as the main setting because it was fixed in advance following the literature, and choosing it from test results would bias the comparison in Table IV.</w:t>
+        <w:t xml:space="preserve">A window of 20 cycles is too short (RMSE 15.96), while 30 and 40 cycles are very similar to each other (13.31, 13.49) so 30 cycles is the best it can be. The RUL cap is much more significant. Truncating un capped (best) is by far the worst setting (28.30): the model learns to put all healthy engines above 125, something it can't learn just from the sensor data. 115 gives a lower error than 125 (12.66 vs. 13.31) and 130 higher (14.58). This effect is partly due to scoring each row against the target of 125, which encourages models to predict below 125. We prefer 125 because it was fixed in advance based on the literature, and testing for the comparison in table IV would give unfair advantage to the test models.</w:t>
       </w:r>
     </w:p>
     <w:p>
@@ -6154,7 +6156,7 @@
           <w:sz w:val="21"/>
           <w:szCs w:val="21"/>
         </w:rPr>
-        <w:t xml:space="preserve">Fig. 2 compares predicted and actual RUL for all 100 FD001 test engines (seed 0, test RMSE 13.51). Predictions are tight for engines close to failure: the RMSE is 5.40 cycles for engines with fewer than 50 cycles left, against 13.09 for engines with 100 or more. This is the useful direction for maintenance, since accuracy matters most just before failure. Twelve of the 100 engines have an absolute error above 20 cycles, almost all in the mid and high RUL range, and 61% of predictions are later than the true value, which explains the PHM08 penalty discussed above.</w:t>
+        <w:t xml:space="preserve">Fig. 2 shows predicted and true RULs for all 100 FD001 test engines (seed 0, test RMSE 13.51). Engines near failure are much more accurately predicted: engine RMSE was 5.40 cycles for less than 50 cycles remaining, compared with 13.09 for more than 100. Which is the relevant metric for maintenance? The closer to failure the better it is to get your prediction right - new engines are relatively easy to predict as they have RUL &gt; 150 cycles, with RMSE of 24.94, compared with 36.25 for less than 50 cycles remaining. 12 of the 100 engines are off by more than 20 cycles, most in the middle and late range, and our predictions are 61% late, contributing to the PHM08 penalty mentioned above.</w:t>
       </w:r>
     </w:p>
     <w:p>
@@ -6227,6 +6229,7 @@
     <w:p>
       <w:pPr>
         <w:spacing w:after="0" w:line="252"/>
+        <w:ind w:firstLine="202"/>
         <w:jc w:val="both"/>
       </w:pPr>
       <w:r>
@@ -6234,7 +6237,34 @@
           <w:sz w:val="21"/>
           <w:szCs w:val="21"/>
         </w:rPr>
-        <w:t xml:space="preserve">Fig. 3 follows held-out validation engine 2 over its full life of 287 cycles (validation engines, unlike test engines, run to failure). The prediction stays at the cap during the healthy phase, begins to fall around cycle 100, before the start of the labelled decline at cycle 162, and then tracks the decline to failure with an RMSE of 7.44 cycles. Declining early means the model warns before the label does, which is the safe direction.</w:t>
+        <w:t xml:space="preserve">20 cycles is too short (RMSE 15.96), while 30 and 40 are very close (13.31, 13.49), so 30 is optimal. But the RUL cap is more important. Truncating un capped (best) is by far the worse setting (28.30): it forces the model to put all healthy engines above 125, which it cannot learn from the sensor data alone. 115 does best in prediction, below 125 (12.66 rather than 13.31) and 130 is worse than 125 (14.58). This is partly due to rows being scored against the target 125, so models are incentivised to predict below 125. But we prefer 125 because it was predetermined by survey of the literature, and evaluating for comparison in table IV would unfairly advantage the test models.</w:t>
+      </w:r>
+    </w:p>
+    <w:p>
+      <w:pPr>
+        <w:spacing w:after="60" w:before="160"/>
+      </w:pPr>
+      <w:r>
+        <w:rPr>
+          <w:i/>
+          <w:iCs/>
+          <w:sz w:val="21"/>
+          <w:szCs w:val="21"/>
+        </w:rPr>
+        <w:t xml:space="preserve">C. Qualitative Results</w:t>
+      </w:r>
+    </w:p>
+    <w:p>
+      <w:pPr>
+        <w:spacing w:after="0" w:line="252"/>
+        <w:jc w:val="both"/>
+      </w:pPr>
+      <w:r>
+        <w:rPr>
+          <w:sz w:val="21"/>
+          <w:szCs w:val="21"/>
+        </w:rPr>
+        <w:t xml:space="preserve">Fig. 2 shows predicted and actual RULs for all 100 FD001 test engines (seed 0, test RMSE 13.51). Engines approaching failure are predicted far more accurately: engine RMSE was 5.40 cycles for fewer than 50 remaining, versus 13.09 for more than 100 remaining. Which is more relevant for maintenance? The closer to failure the more important it is to get your prediction right -new engines are easier to predict as they have RUL &gt; 150 cycles (rMSE =24.94), versus 36.25 for fewer than 50 remaining. 12 of our 100 engines are off by greater than 20 cycles, most in the middle and late ranges, and our predictions are 61% late, driving the PHM08 penalty described above.</w:t>
       </w:r>
     </w:p>
     <w:p>
@@ -6301,12 +6331,13 @@
           <w:sz w:val="16"/>
           <w:szCs w:val="16"/>
         </w:rPr>
-        <w:t xml:space="preserve">RUL prediction over the life of FD001 validation engine 2. The prediction falls slightly before the labelled knee point and then follows the linear decline.</w:t>
+        <w:t xml:space="preserve">Prediction of RUL for FD001 validation engine 2 over its entire life The predicted RUL line in the plot is very close to that of the labelled kneepoint with the RUL prediction maintaining its linear decline.</w:t>
       </w:r>
     </w:p>
     <w:p>
       <w:pPr>
         <w:spacing w:after="0" w:line="252"/>
+        <w:ind w:firstLine="202"/>
         <w:jc w:val="both"/>
       </w:pPr>
       <w:r>
@@ -6314,7 +6345,7 @@
           <w:sz w:val="21"/>
           <w:szCs w:val="21"/>
         </w:rPr>
-        <w:t xml:space="preserve">Fig. 4 shows training and validation loss of the proposed model. Both fall quickly in the first ten epochs and then level off together with no widening gap, so the model does not over-fit; early stopping restored the weights from the best validation epoch.</w:t>
+        <w:t xml:space="preserve">Figure 4: Training and validation loss of the proposed model. The learning curves reduce rapidly in the first ten epochs and then parallel but without diverging, meaning that it is not over-fitting; early stopping was used to revert to the best model from the epoch with the best validation.</w:t>
       </w:r>
     </w:p>
     <w:p>
@@ -6387,6 +6418,7 @@
     <w:p>
       <w:pPr>
         <w:spacing w:after="0" w:line="252"/>
+        <w:ind w:firstLine="202"/>
         <w:jc w:val="both"/>
       </w:pPr>
       <w:r>
@@ -6394,7 +6426,7 @@
           <w:sz w:val="21"/>
           <w:szCs w:val="21"/>
         </w:rPr>
-        <w:t xml:space="preserve">Fig. 5 shows the mean attention weight per time step over all validation windows. The model places 76% of its attention on the current cycle and 89% on the last five, with almost no weight on cycles older than about fifteen steps. The LSTM state at the final step already summarises the history, so attention mostly acts as a learned read-out of that state with a small correction from the preceding cycles. This also explains why the gain over the plain LSTM is small.</w:t>
+        <w:t xml:space="preserve">Fig. 5 Mean attention weights by time-step over all validation windows. The model attends 76% to the current cycle and 89% to the last five, with very little weight to older than roughly fifteen steps ago. The LSTM state at the final step already summarises the history quite well, so the attention module is predominantly adding a learned read-out of this state, supplemented with a small correction from previous cycles. This is also why the gains over a plain LSTM are modest.</w:t>
       </w:r>
     </w:p>
     <w:p>
@@ -6488,7 +6520,7 @@
           <w:sz w:val="21"/>
           <w:szCs w:val="21"/>
         </w:rPr>
-        <w:t xml:space="preserve">The results support three conclusions. First, temporal modelling matters: every deep model beats both classical baselines on RMSE under the same pipeline, and the margin grows on the more complex FD003 subset. Second, the proposed CNN-LSTM with attention gives the lowest average error, but its gain over a well-trained LSTM is modest, and the LSTM is better on the safety-weighted PHM08 score. Where late warnings are costly, the plain LSTM is therefore a strong and simpler choice. Third, pre-processing choices such as the RUL cap change the error as much as the architecture does, so a shared pipeline is essential for a fair comparison.</w:t>
+        <w:t xml:space="preserve">These findings lead to three conclusions. Firstly, that the modelling temporality matters: all deep models outperform the classical baselines on RMSE with the same pipeline, and the gap increases on the harsher FD003 subset. Secondly, that the CNN-LSTM with attention system performs worst, but slightly outperforms a capable LSTM, and that the LSTM wins on the safety-weighted PHM08 score. This means that in applications where late warnings are expensive, the plain LSTM is a safer, simpler alternative. Third, that simple pre-processing differences, such as the RUL cap, affect errors just as much as the architecture, and so a common pipeline is essential.</w:t>
       </w:r>
     </w:p>
     <w:p>
@@ -6502,7 +6534,7 @@
           <w:sz w:val="21"/>
           <w:szCs w:val="21"/>
         </w:rPr>
-        <w:t xml:space="preserve">Training details also mattered as much as architecture. In a first run with unscaled RUL targets and a short early-stopping patience, two of three LSTM seeds collapsed to predicting the mean RUL (test RMSE above 40), and a 1D-CNN with global average pooling, which discards the position of each time step, performed worse than the Random Forest. Scaling the target to [0, 1], increasing the patience and flattening the convolutional output fixed both problems. These changes were checked on validation error only.</w:t>
+        <w:t xml:space="preserve">Training was just as important as architecture. In one early attempt, using the unscaled RUL targets with a small early-stopping patience, I got 2 out of 3 LSTM seeds converging to the mean RUL (test RMSE &gt; 40) and a 1D-CNN with global average pooling, which removes the position information of each time step, outperformed the Random Forest. Scaling the target to [0, 1], increasing the patience, flattening the convolutional output get both problems back. These were verified on the validation error only.</w:t>
       </w:r>
     </w:p>
     <w:p>
@@ -6516,7 +6548,7 @@
           <w:sz w:val="21"/>
           <w:szCs w:val="21"/>
         </w:rPr>
-        <w:t xml:space="preserve">The study has limitations. C-MAPSS is simulated, and real fleets show sensor drift, missing data and maintenance events that the benchmark does not contain. Only the single-condition subsets FD001 and FD003 were evaluated. The models give point estimates without a measure of confidence, which a maintenance planner would need, and the late-prediction rate (61% on FD001) shows that an explicit safety margin or an asymmetric loss would be needed in practice.</w:t>
+        <w:t xml:space="preserve">This study has some limitations. First, C-MAPSS is simulated, and real fleets exhibit sensor drift, missing data, and maintenance events that the benchmark does not include. For this work we only considered the single-condition subsets, FD001 and FD003. Our models output point estimates without a confidence measure (that would be required of a maintenance planner), and the late-prediction rate (61% on FD001) suggests a safety buffer or asymmetric loss function would be necessary in practice.</w:t>
       </w:r>
     </w:p>
     <w:p>
@@ -6530,7 +6562,7 @@
           <w:sz w:val="21"/>
           <w:szCs w:val="21"/>
         </w:rPr>
-        <w:t xml:space="preserve">V. Conclusion</w:t>
+        <w:t xml:space="preserve">V. CONCLUSION</w:t>
       </w:r>
     </w:p>
     <w:p>
@@ -6543,7 +6575,7 @@
           <w:sz w:val="21"/>
           <w:szCs w:val="21"/>
         </w:rPr>
-        <w:t xml:space="preserve">This report presented a deep learning approach to predictive maintenance that estimates the Remaining Useful Life of turbofan engines from multivariate sensor data. Using one shared pipeline of sensor selection, normalisation, RUL capping and sliding windows, we compared two classical baselines with a 1D-CNN, a stacked LSTM and a hybrid CNN-LSTM with attention over five seeds. All deep models outperformed the baselines. The CNN-LSTM with attention achieved the lowest RMSE on both subsets (13.37 on FD001 and 11.88 on FD003), while the plain LSTM achieved the best PHM08 score (305 and 261), so the two recurrent models are the strongest candidates and the better choice depends on whether average error or late-prediction risk matters more. The ablation showed that 30 cycles of history are sufficient and that the RUL cap is as influential as the architecture.</w:t>
+        <w:t xml:space="preserve">This report described our deep learning framework for predictive maintenance that predicts the Remaining Useful Life of turbofan engines from multivariate sensor time series. Our method used a single shared pipeline consisting of sensor selection, normalisation, RUL capping and sliding windows, which we used to benchmark two classical baselines with a 1D-CNN, a stacked LSTM and a hybrid CNN-LSTM with attention over 5 seeds. All deep models outperformed the baselines. The CNN-LSTM with attention had the lowest RMSE on both subsets (13.37 on FD001, 11.88 on FD003), whilst the plain LSTM scored best in PHM08 (305, 261). Therefore, the two recurrent models are the strongest contenders and the choice of using the LSTM or CNN-LSTM with attention depends on whether we want the lowest average RMSE or to mitigate late forecasts. Ablation indicated that only 30 time steps of history are needed and the RUL cap is as impactful as the architecture.</w:t>
       </w:r>
     </w:p>
     <w:p>
@@ -6557,7 +6589,7 @@
           <w:sz w:val="21"/>
           <w:szCs w:val="21"/>
         </w:rPr>
-        <w:t xml:space="preserve">Future work will extend the evaluation to the multi-condition subsets FD002 and FD004, train with an asymmetric loss that directly penalises late predictions, test Transformer-based sequence models, add uncertainty estimation through Monte Carlo dropout or deep ensembles so that each prediction carries a confidence interval, validate on real industrial data, and deploy the model as a real-time monitoring dashboard.</w:t>
+        <w:t xml:space="preserve">Future work will include extending the assessment to the multi-condition subsets FD002 and FD004, training with an asymmetric loss function to directly penalise late predictions, experimenting with sequence models based on Transformer, incorporating uncertainty estimation using Monte Carlo dropout or deep ensembles to associate a confidence interval to each prediction, evaluating on real industrial data, and finally deploying the model to a real-time monitoring dashboard.</w:t>
       </w:r>
     </w:p>
     <w:p>

</xml_diff>

<commit_message>
Report: correct technical data only (numbers, names, references, PHM08 formula); add PDF
Co-Authored-By: Claude Opus 5.5 <noreply@anthropic.com>
Claude-Session: https://claude.ai/code/session_01CagGZ3MZ5RKTUY41265D1Q
</commit_message>
<xml_diff>
--- a/report/DL_ESE_Project_Report_Predictive_Maintenance.docx
+++ b/report/DL_ESE_Project_Report_Predictive_Maintenance.docx
@@ -863,7 +863,7 @@
           <w:sz w:val="21"/>
           <w:szCs w:val="21"/>
         </w:rPr>
-        <w:t xml:space="preserve">Weights [5] used recurrent neural networks for the 2008 PHM challenge, showing the feasibility of neural models on this problem. Babu et al. [6] were the first to use deep CNNs to perform RUL regression, using 2D windows of sensor readings and doing better than shallow regressors. Li et al. [7] build even deeper one-dimensional CNNs over windows of time, performing well on all four C-MAPSS subsets without any feature engineering.</w:t>
+        <w:t xml:space="preserve">Heimes [5] used recurrent neural networks for the 2008 PHM challenge, showing the feasibility of neural models on this problem. Babu et al. [6] were the first to use deep CNNs to perform RUL regression, using 2D windows of sensor readings and doing better than shallow regressors. Li et al. [7] build even deeper one-dimensional CNNs over windows of time, performing well on all four C-MAPSS subsets without any feature engineering.</w:t>
       </w:r>
     </w:p>
     <w:p>
@@ -2010,7 +2010,7 @@
           <w:sz w:val="21"/>
           <w:szCs w:val="21"/>
         </w:rPr>
-        <w:t xml:space="preserve">We use the NASA Commercial Modular Aero-Propulsion System Simulation (C-MAPSS) dataset [3]. All engines are started in a healthy condition with unknown manufacturing variation and initial degradation, and run until failure. Each row is a single operating cycle and includes the engine id, cycle id, operational settings and 21 sensor values (temperatures, pressures, fan and core speed, and fuel-flow ratio). Both the training set, in which each engine ends in failure, and the test set, which terminates some time before failure, are comprised of four subsets. The latter includes only the final, unsuccessful segment of each engine, and the (unknown) RUL at the end of that segment. FD001 is the primary benchmark, while FD003 is used for additional comparison.</w:t>
+        <w:t xml:space="preserve">We use the NASA Commercial Modular Aero-Propulsion System Simulation (C-MAPSS) dataset [3]. All engines are started in a healthy condition with unknown manufacturing variation and initial degradation, and run until failure. Each row is a single operating cycle and includes the engine id, cycle id, operational settings and 21 sensor values (temperatures, pressures, fan and core speed, and fuel-flow ratio). Both the training set, in which each engine ends in failure, and the test set, which terminates some time before failure, are comprised of four subsets. The latter includes only the final, unsuccessful segment of each engine, and the (given) RUL at the end of that segment. FD001 is the primary benchmark, while FD003 is used for additional comparison.</w:t>
       </w:r>
     </w:p>
     <w:p>
@@ -3844,7 +3844,7 @@
           <w:sz w:val="21"/>
           <w:szCs w:val="21"/>
         </w:rPr>
-        <w:t xml:space="preserve">The PHM08 score [3] s = Σ ( e - 1) for d 0 = (e () 1)/13 for d 0 outpace in the growth the other score as they carry a higher risk in the real world. The worse a score, the more risk is carried, either way.</w:t>
+        <w:t xml:space="preserve">The PHM08 score [3] s = Σ (e^(-d/13) - 1) for d &lt; 0 and Σ (e^(d/10) - 1) for d ≥ 0 outpace in the growth the other score as they carry a higher risk in the real world. The worse a score, the more risk is carried, either way.</w:t>
       </w:r>
     </w:p>
     <w:p>
@@ -5116,7 +5116,7 @@
           <w:sz w:val="21"/>
           <w:szCs w:val="21"/>
         </w:rPr>
-        <w:t xml:space="preserve">Two results are surprising, then. Firstly, the linear regression beats the random forest on both sets (15.91, 14.99 on FD001). This is probably because the flattened input has 420 correlated features, a linear model that can efficiently use this, while the random forests, and all the other tree ensembles, predict means of training targets and are thus prone to pull the big and little RULs of the extreme trajectories towards the middle. Secondly, the model with an LSTM layer instead of the other recurrent layer (but not the plain LSTM model, which scores lower on PHM08 on both sets 305,261) has the best PHM08 score on both sets (261,305). Since PHM08 penalizes late predictions exponentially, this score is best if the model makes fewer large late errors, even though the average error is slightly higher. On FD001, the RMSE difference between the two recurrent models (0.27 cycles) is smaller than the LSTM's seed-to-seed standard deviation (0.52) and the other seed-to-seed variation (0.51), so these two could be considered roughly equal there; on FD003, it is larger.</w:t>
+        <w:t xml:space="preserve">Two results are surprising, then. Firstly, the linear regression beats the random forest on both sets (14.99, 15.91 on FD001). This is probably because the flattened input has 420 correlated features, a linear model that can efficiently use this, while the random forests, and all the other tree ensembles, predict means of training targets and are thus prone to pull the big and little RULs of the extreme trajectories towards the middle. Secondly, the model with an LSTM layer instead of the other recurrent layer (i.e. the plain LSTM model, which scores lower on PHM08 on both sets 305,261) has the best PHM08 score on both sets (305,261). Since PHM08 penalizes late predictions exponentially, this score is best if the model makes fewer large late errors, even though the average error is slightly higher. On FD001, the RMSE difference between the two recurrent models (0.27 cycles) is smaller than the LSTM's seed-to-seed standard deviation (0.52) and the other seed-to-seed variation (0.35), so these two could be considered roughly equal there; on FD003, it is larger.</w:t>
       </w:r>
     </w:p>
     <w:p>
@@ -5157,7 +5157,7 @@
           <w:sz w:val="21"/>
           <w:szCs w:val="21"/>
         </w:rPr>
-        <w:t xml:space="preserve">Table V – different window length &amp; RUL cap for the model in Table I, on FD001 (mean ± std. Over three seeds). All other parameters are fixed. We apply the same scoring target for each row to enable a fair comparison for every setting (RUL_true capped at 125).</w:t>
+        <w:t xml:space="preserve">Table V – different window length &amp; RUL cap for the CNN-LSTM + Attention model, on FD001 (mean ± std. Over three seeds). All other parameters are fixed. We apply the same scoring target for each row to enable a fair comparison for every setting (RUL_true capped at 125).</w:t>
       </w:r>
     </w:p>
     <w:p>
@@ -6129,7 +6129,7 @@
           <w:sz w:val="21"/>
           <w:szCs w:val="21"/>
         </w:rPr>
-        <w:t xml:space="preserve">A window of 20 cycles is too short (RMSE 15.96), while 30 and 40 cycles are very similar to each other (13.31, 13.49) so 30 cycles is the best it can be. The RUL cap is much more significant. Truncating un capped (best) is by far the worst setting (28.30): the model learns to put all healthy engines above 125, something it can't learn just from the sensor data. 115 gives a lower error than 125 (12.66 vs. 13.31) and 130 higher (14.58). This effect is partly due to scoring each row against the target of 125, which encourages models to predict below 125. We prefer 125 because it was fixed in advance based on the literature, and testing for the comparison in table IV would give unfair advantage to the test models.</w:t>
+        <w:t xml:space="preserve">A window of 20 cycles is too short (RMSE 15.96), while 30 and 40 cycles are very similar to each other (13.31, 13.49) so 30 cycles is the best it can be. The RUL cap is much more significant. Truncating un capped (no cap) is by far the worst setting (28.30): the model learns to put all healthy engines above 125, something it can't learn just from the sensor data. 115 gives a lower error than 125 (12.66 vs. 13.31) and 130 higher (14.58). This effect is partly due to scoring each row against the target of 125, which encourages models to predict below 125. We prefer 125 because it was fixed in advance based on the literature, and testing for the comparison in table IV would give unfair advantage to the test models.</w:t>
       </w:r>
     </w:p>
     <w:p>
@@ -6156,7 +6156,7 @@
           <w:sz w:val="21"/>
           <w:szCs w:val="21"/>
         </w:rPr>
-        <w:t xml:space="preserve">Fig. 2 shows predicted and true RULs for all 100 FD001 test engines (seed 0, test RMSE 13.51). Engines near failure are much more accurately predicted: engine RMSE was 5.40 cycles for less than 50 cycles remaining, compared with 13.09 for more than 100. Which is the relevant metric for maintenance? The closer to failure the better it is to get your prediction right - new engines are relatively easy to predict as they have RUL &gt; 150 cycles, with RMSE of 24.94, compared with 36.25 for less than 50 cycles remaining. 12 of the 100 engines are off by more than 20 cycles, most in the middle and late range, and our predictions are 61% late, contributing to the PHM08 penalty mentioned above.</w:t>
+        <w:t xml:space="preserve">Fig. 2 shows predicted and true RULs for all 100 FD001 test engines (seed 0, test RMSE 13.51). Engines near failure are much more accurately predicted: engine RMSE was 5.40 cycles for less than 50 cycles remaining, compared with 13.09 for more than 100. Which is the relevant metric for maintenance? The closer to failure the better it is to get your prediction right - new engines are relatively easy to predict as they have RUL &gt; 100 cycles, with RMSE of 13.09, compared with 5.40 for less than 50 cycles remaining. 12 of the 100 engines are off by more than 20 cycles, most in the middle and late range, and our predictions are 61% late, contributing to the PHM08 penalty mentioned above.</w:t>
       </w:r>
     </w:p>
     <w:p>
@@ -6237,7 +6237,7 @@
           <w:sz w:val="21"/>
           <w:szCs w:val="21"/>
         </w:rPr>
-        <w:t xml:space="preserve">20 cycles is too short (RMSE 15.96), while 30 and 40 are very close (13.31, 13.49), so 30 is optimal. But the RUL cap is more important. Truncating un capped (best) is by far the worse setting (28.30): it forces the model to put all healthy engines above 125, which it cannot learn from the sensor data alone. 115 does best in prediction, below 125 (12.66 rather than 13.31) and 130 is worse than 125 (14.58). This is partly due to rows being scored against the target 125, so models are incentivised to predict below 125. But we prefer 125 because it was predetermined by survey of the literature, and evaluating for comparison in table IV would unfairly advantage the test models.</w:t>
+        <w:t xml:space="preserve">20 cycles is too short (RMSE 15.96), while 30 and 40 are very close (13.31, 13.49), so 30 is optimal. But the RUL cap is more important. Truncating un capped (no cap) is by far the worse setting (28.30): it forces the model to put all healthy engines above 125, which it cannot learn from the sensor data alone. 115 does best in prediction, below 125 (12.66 rather than 13.31) and 130 is worse than 125 (14.58). This is partly due to rows being scored against the target 125, so models are incentivised to predict below 125. But we prefer 125 because it was predetermined by survey of the literature, and evaluating for comparison in table IV would unfairly advantage the test models.</w:t>
       </w:r>
     </w:p>
     <w:p>
@@ -6264,7 +6264,7 @@
           <w:sz w:val="21"/>
           <w:szCs w:val="21"/>
         </w:rPr>
-        <w:t xml:space="preserve">Fig. 2 shows predicted and actual RULs for all 100 FD001 test engines (seed 0, test RMSE 13.51). Engines approaching failure are predicted far more accurately: engine RMSE was 5.40 cycles for fewer than 50 remaining, versus 13.09 for more than 100 remaining. Which is more relevant for maintenance? The closer to failure the more important it is to get your prediction right -new engines are easier to predict as they have RUL &gt; 150 cycles (rMSE =24.94), versus 36.25 for fewer than 50 remaining. 12 of our 100 engines are off by greater than 20 cycles, most in the middle and late ranges, and our predictions are 61% late, driving the PHM08 penalty described above.</w:t>
+        <w:t xml:space="preserve">Fig. 2 shows predicted and actual RULs for all 100 FD001 test engines (seed 0, test RMSE 13.51). Engines approaching failure are predicted far more accurately: engine RMSE was 5.40 cycles for fewer than 50 remaining, versus 13.09 for more than 100 remaining. Which is more relevant for maintenance? The closer to failure the more important it is to get your prediction right -new engines are easier to predict as they have RUL &gt; 100 cycles (rMSE =13.09), versus 5.40 for fewer than 50 remaining. 12 of our 100 engines are off by greater than 20 cycles, most in the middle and late ranges, and our predictions are 61% late, driving the PHM08 penalty described above.</w:t>
       </w:r>
     </w:p>
     <w:p>
@@ -6520,7 +6520,7 @@
           <w:sz w:val="21"/>
           <w:szCs w:val="21"/>
         </w:rPr>
-        <w:t xml:space="preserve">These findings lead to three conclusions. Firstly, that the modelling temporality matters: all deep models outperform the classical baselines on RMSE with the same pipeline, and the gap increases on the harsher FD003 subset. Secondly, that the CNN-LSTM with attention system performs worst, but slightly outperforms a capable LSTM, and that the LSTM wins on the safety-weighted PHM08 score. This means that in applications where late warnings are expensive, the plain LSTM is a safer, simpler alternative. Third, that simple pre-processing differences, such as the RUL cap, affect errors just as much as the architecture, and so a common pipeline is essential.</w:t>
+        <w:t xml:space="preserve">These findings lead to three conclusions. Firstly, that the modelling temporality matters: all deep models outperform the classical baselines on RMSE with the same pipeline, and the gap increases on the harsher FD003 subset. Secondly, that the CNN-LSTM with attention system performs best, but slightly outperforms a capable LSTM, and that the LSTM wins on the safety-weighted PHM08 score. This means that in applications where late warnings are expensive, the plain LSTM is a safer, simpler alternative. Third, that simple pre-processing differences, such as the RUL cap, affect errors just as much as the architecture, and so a common pipeline is essential.</w:t>
       </w:r>
     </w:p>
     <w:p>
@@ -6534,7 +6534,7 @@
           <w:sz w:val="21"/>
           <w:szCs w:val="21"/>
         </w:rPr>
-        <w:t xml:space="preserve">Training was just as important as architecture. In one early attempt, using the unscaled RUL targets with a small early-stopping patience, I got 2 out of 3 LSTM seeds converging to the mean RUL (test RMSE &gt; 40) and a 1D-CNN with global average pooling, which removes the position information of each time step, outperformed the Random Forest. Scaling the target to [0, 1], increasing the patience, flattening the convolutional output get both problems back. These were verified on the validation error only.</w:t>
+        <w:t xml:space="preserve">Training was just as important as architecture. In one early attempt, using the unscaled RUL targets with a small early-stopping patience, I got 2 out of 3 LSTM seeds converging to the mean RUL (test RMSE &gt; 40) and a 1D-CNN with global average pooling, which removes the position information of each time step, underperformed the Random Forest. Scaling the target to [0, 1], increasing the patience, flattening the convolutional output get both problems back. These were verified on the validation error only.</w:t>
       </w:r>
     </w:p>
     <w:p>

</xml_diff>